<commit_message>
Generate pending DOCX (Product Card, Feature Tile, Order List)
Regenerated Product Card DOCX (per-layer property table) and generated the
Feature Tile (2) and Order List (3) DOCX from their markdown, now that the
package index is reachable via the proxy.

Co-Authored-By: Claude Opus 4.6 (1M context) <noreply@anthropic.com>
</commit_message>
<xml_diff>
--- a/docs/SDD/Stories/Product-Card/EC-Product-Card-Story.docx
+++ b/docs/SDD/Stories/Product-Card/EC-Product-Card-Story.docx
@@ -600,6 +600,3489 @@
         <w:pStyle w:val="Heading2"/>
       </w:pPr>
       <w:r>
+        <w:t>Per-Layer Figma Properties (Caregiver / Default / Desktop, 274×430)</w:t>
+      </w:r>
+    </w:p>
+    <w:p>
+      <w:r>
+        <w:t xml:space="preserve">Extracted from Figma node 2697-351418. Hex values are the resolved colors; the </w:t>
+      </w:r>
+      <w:r>
+        <w:rPr>
+          <w:b/>
+        </w:rPr>
+        <w:t>Token</w:t>
+      </w:r>
+      <w:r>
+        <w:t xml:space="preserve"> column lists the bound Figma variable ID where the value is tokenized (variable *names* require design-system/Enterprise access to resolve — IDs given so the design team can map them). Fonts: </w:t>
+      </w:r>
+      <w:r>
+        <w:rPr>
+          <w:b/>
+        </w:rPr>
+        <w:t>Trefoil Sans</w:t>
+      </w:r>
+      <w:r>
+        <w:t xml:space="preserve"> throughout.</w:t>
+      </w:r>
+    </w:p>
+    <w:tbl>
+      <w:tblPr>
+        <w:tblStyle w:val="TableGrid"/>
+        <w:tblW w:type="auto" w:w="0"/>
+        <w:jc w:val="left"/>
+        <w:tblLook w:firstColumn="1" w:firstRow="1" w:lastColumn="0" w:lastRow="0" w:noHBand="0" w:noVBand="1" w:val="04A0"/>
+      </w:tblPr>
+      <w:tblGrid>
+        <w:gridCol w:w="1234"/>
+        <w:gridCol w:w="1234"/>
+        <w:gridCol w:w="1234"/>
+        <w:gridCol w:w="1234"/>
+        <w:gridCol w:w="1234"/>
+        <w:gridCol w:w="1234"/>
+        <w:gridCol w:w="1234"/>
+      </w:tblGrid>
+      <w:tr>
+        <w:tc>
+          <w:tcPr>
+            <w:tcW w:type="dxa" w:w="1234"/>
+            <w:shd w:fill="2C3E50" w:val="clear"/>
+          </w:tcPr>
+          <w:p>
+            <w:r>
+              <w:rPr>
+                <w:b/>
+                <w:color w:val="FFFFFF"/>
+                <w:sz w:val="18"/>
+              </w:rPr>
+            </w:r>
+            <w:r>
+              <w:rPr>
+                <w:b/>
+                <w:color w:val="FFFFFF"/>
+                <w:sz w:val="18"/>
+              </w:rPr>
+              <w:t>Layer</w:t>
+            </w:r>
+          </w:p>
+        </w:tc>
+        <w:tc>
+          <w:tcPr>
+            <w:tcW w:type="dxa" w:w="1234"/>
+            <w:shd w:fill="2C3E50" w:val="clear"/>
+          </w:tcPr>
+          <w:p>
+            <w:r>
+              <w:rPr>
+                <w:b/>
+                <w:color w:val="FFFFFF"/>
+                <w:sz w:val="18"/>
+              </w:rPr>
+            </w:r>
+            <w:r>
+              <w:rPr>
+                <w:b/>
+                <w:color w:val="FFFFFF"/>
+                <w:sz w:val="18"/>
+              </w:rPr>
+              <w:t>Size (W×H)</w:t>
+            </w:r>
+          </w:p>
+        </w:tc>
+        <w:tc>
+          <w:tcPr>
+            <w:tcW w:type="dxa" w:w="1234"/>
+            <w:shd w:fill="2C3E50" w:val="clear"/>
+          </w:tcPr>
+          <w:p>
+            <w:r>
+              <w:rPr>
+                <w:b/>
+                <w:color w:val="FFFFFF"/>
+                <w:sz w:val="18"/>
+              </w:rPr>
+            </w:r>
+            <w:r>
+              <w:rPr>
+                <w:b/>
+                <w:color w:val="FFFFFF"/>
+                <w:sz w:val="18"/>
+              </w:rPr>
+              <w:t>Font (family wt size/lh)</w:t>
+            </w:r>
+          </w:p>
+        </w:tc>
+        <w:tc>
+          <w:tcPr>
+            <w:tcW w:type="dxa" w:w="1234"/>
+            <w:shd w:fill="2C3E50" w:val="clear"/>
+          </w:tcPr>
+          <w:p>
+            <w:r>
+              <w:rPr>
+                <w:b/>
+                <w:color w:val="FFFFFF"/>
+                <w:sz w:val="18"/>
+              </w:rPr>
+            </w:r>
+            <w:r>
+              <w:rPr>
+                <w:b/>
+                <w:color w:val="FFFFFF"/>
+                <w:sz w:val="18"/>
+              </w:rPr>
+              <w:t>Color (hex)</w:t>
+            </w:r>
+          </w:p>
+        </w:tc>
+        <w:tc>
+          <w:tcPr>
+            <w:tcW w:type="dxa" w:w="1234"/>
+            <w:shd w:fill="2C3E50" w:val="clear"/>
+          </w:tcPr>
+          <w:p>
+            <w:r>
+              <w:rPr>
+                <w:b/>
+                <w:color w:val="FFFFFF"/>
+                <w:sz w:val="18"/>
+              </w:rPr>
+            </w:r>
+            <w:r>
+              <w:rPr>
+                <w:b/>
+                <w:color w:val="FFFFFF"/>
+                <w:sz w:val="18"/>
+              </w:rPr>
+              <w:t>Border / Radius</w:t>
+            </w:r>
+          </w:p>
+        </w:tc>
+        <w:tc>
+          <w:tcPr>
+            <w:tcW w:type="dxa" w:w="1234"/>
+            <w:shd w:fill="2C3E50" w:val="clear"/>
+          </w:tcPr>
+          <w:p>
+            <w:r>
+              <w:rPr>
+                <w:b/>
+                <w:color w:val="FFFFFF"/>
+                <w:sz w:val="18"/>
+              </w:rPr>
+            </w:r>
+            <w:r>
+              <w:rPr>
+                <w:b/>
+                <w:color w:val="FFFFFF"/>
+                <w:sz w:val="18"/>
+              </w:rPr>
+              <w:t>Padding / Gap</w:t>
+            </w:r>
+          </w:p>
+        </w:tc>
+        <w:tc>
+          <w:tcPr>
+            <w:tcW w:type="dxa" w:w="1234"/>
+            <w:shd w:fill="2C3E50" w:val="clear"/>
+          </w:tcPr>
+          <w:p>
+            <w:r>
+              <w:rPr>
+                <w:b/>
+                <w:color w:val="FFFFFF"/>
+                <w:sz w:val="18"/>
+              </w:rPr>
+            </w:r>
+            <w:r>
+              <w:rPr>
+                <w:b/>
+                <w:color w:val="FFFFFF"/>
+                <w:sz w:val="18"/>
+              </w:rPr>
+              <w:t>Token (Figma variable id)</w:t>
+            </w:r>
+          </w:p>
+        </w:tc>
+      </w:tr>
+      <w:tr>
+        <w:tc>
+          <w:tcPr>
+            <w:tcW w:type="dxa" w:w="1234"/>
+          </w:tcPr>
+          <w:p>
+            <w:r>
+              <w:rPr>
+                <w:sz w:val="18"/>
+              </w:rPr>
+            </w:r>
+            <w:r>
+              <w:rPr>
+                <w:sz w:val="18"/>
+              </w:rPr>
+              <w:t>Card (root)</w:t>
+            </w:r>
+          </w:p>
+        </w:tc>
+        <w:tc>
+          <w:tcPr>
+            <w:tcW w:type="dxa" w:w="1234"/>
+          </w:tcPr>
+          <w:p>
+            <w:r>
+              <w:rPr>
+                <w:sz w:val="18"/>
+              </w:rPr>
+            </w:r>
+            <w:r>
+              <w:rPr>
+                <w:sz w:val="18"/>
+              </w:rPr>
+              <w:t>274×430</w:t>
+            </w:r>
+          </w:p>
+        </w:tc>
+        <w:tc>
+          <w:tcPr>
+            <w:tcW w:type="dxa" w:w="1234"/>
+          </w:tcPr>
+          <w:p>
+            <w:r>
+              <w:rPr>
+                <w:sz w:val="18"/>
+              </w:rPr>
+            </w:r>
+            <w:r>
+              <w:rPr>
+                <w:sz w:val="18"/>
+              </w:rPr>
+              <w:t>—</w:t>
+            </w:r>
+          </w:p>
+        </w:tc>
+        <w:tc>
+          <w:tcPr>
+            <w:tcW w:type="dxa" w:w="1234"/>
+          </w:tcPr>
+          <w:p>
+            <w:r>
+              <w:rPr>
+                <w:sz w:val="18"/>
+              </w:rPr>
+            </w:r>
+            <w:r>
+              <w:rPr>
+                <w:sz w:val="18"/>
+              </w:rPr>
+              <w:t>—</w:t>
+            </w:r>
+          </w:p>
+        </w:tc>
+        <w:tc>
+          <w:tcPr>
+            <w:tcW w:type="dxa" w:w="1234"/>
+          </w:tcPr>
+          <w:p>
+            <w:r>
+              <w:rPr>
+                <w:sz w:val="18"/>
+              </w:rPr>
+            </w:r>
+            <w:r>
+              <w:rPr>
+                <w:sz w:val="18"/>
+              </w:rPr>
+              <w:t>stroke #D5CA9F</w:t>
+            </w:r>
+          </w:p>
+        </w:tc>
+        <w:tc>
+          <w:tcPr>
+            <w:tcW w:type="dxa" w:w="1234"/>
+          </w:tcPr>
+          <w:p>
+            <w:r>
+              <w:rPr>
+                <w:sz w:val="18"/>
+              </w:rPr>
+            </w:r>
+            <w:r>
+              <w:rPr>
+                <w:sz w:val="18"/>
+              </w:rPr>
+              <w:t>gap 8</w:t>
+            </w:r>
+          </w:p>
+        </w:tc>
+        <w:tc>
+          <w:tcPr>
+            <w:tcW w:type="dxa" w:w="1234"/>
+          </w:tcPr>
+          <w:p>
+            <w:r>
+              <w:rPr>
+                <w:sz w:val="18"/>
+              </w:rPr>
+            </w:r>
+            <w:r>
+              <w:rPr>
+                <w:sz w:val="18"/>
+              </w:rPr>
+              <w:t>strokes bound</w:t>
+            </w:r>
+          </w:p>
+        </w:tc>
+      </w:tr>
+      <w:tr>
+        <w:tc>
+          <w:tcPr>
+            <w:tcW w:type="dxa" w:w="1234"/>
+            <w:shd w:fill="F4F6F7" w:val="clear"/>
+          </w:tcPr>
+          <w:p>
+            <w:r>
+              <w:rPr>
+                <w:sz w:val="18"/>
+              </w:rPr>
+            </w:r>
+            <w:r>
+              <w:rPr>
+                <w:sz w:val="18"/>
+              </w:rPr>
+              <w:t>Image frame</w:t>
+            </w:r>
+          </w:p>
+        </w:tc>
+        <w:tc>
+          <w:tcPr>
+            <w:tcW w:type="dxa" w:w="1234"/>
+            <w:shd w:fill="F4F6F7" w:val="clear"/>
+          </w:tcPr>
+          <w:p>
+            <w:r>
+              <w:rPr>
+                <w:sz w:val="18"/>
+              </w:rPr>
+            </w:r>
+            <w:r>
+              <w:rPr>
+                <w:sz w:val="18"/>
+              </w:rPr>
+              <w:t>274×274</w:t>
+            </w:r>
+          </w:p>
+        </w:tc>
+        <w:tc>
+          <w:tcPr>
+            <w:tcW w:type="dxa" w:w="1234"/>
+            <w:shd w:fill="F4F6F7" w:val="clear"/>
+          </w:tcPr>
+          <w:p>
+            <w:r>
+              <w:rPr>
+                <w:sz w:val="18"/>
+              </w:rPr>
+            </w:r>
+            <w:r>
+              <w:rPr>
+                <w:sz w:val="18"/>
+              </w:rPr>
+              <w:t>—</w:t>
+            </w:r>
+          </w:p>
+        </w:tc>
+        <w:tc>
+          <w:tcPr>
+            <w:tcW w:type="dxa" w:w="1234"/>
+            <w:shd w:fill="F4F6F7" w:val="clear"/>
+          </w:tcPr>
+          <w:p>
+            <w:r>
+              <w:rPr>
+                <w:sz w:val="18"/>
+              </w:rPr>
+            </w:r>
+            <w:r>
+              <w:rPr>
+                <w:sz w:val="18"/>
+              </w:rPr>
+              <w:t>—</w:t>
+            </w:r>
+          </w:p>
+        </w:tc>
+        <w:tc>
+          <w:tcPr>
+            <w:tcW w:type="dxa" w:w="1234"/>
+            <w:shd w:fill="F4F6F7" w:val="clear"/>
+          </w:tcPr>
+          <w:p>
+            <w:r>
+              <w:rPr>
+                <w:sz w:val="18"/>
+              </w:rPr>
+            </w:r>
+            <w:r>
+              <w:rPr>
+                <w:sz w:val="18"/>
+              </w:rPr>
+              <w:t>stroke #D5CA9F, radius 4</w:t>
+            </w:r>
+          </w:p>
+        </w:tc>
+        <w:tc>
+          <w:tcPr>
+            <w:tcW w:type="dxa" w:w="1234"/>
+            <w:shd w:fill="F4F6F7" w:val="clear"/>
+          </w:tcPr>
+          <w:p>
+            <w:r>
+              <w:rPr>
+                <w:sz w:val="18"/>
+              </w:rPr>
+            </w:r>
+            <w:r>
+              <w:rPr>
+                <w:sz w:val="18"/>
+              </w:rPr>
+              <w:t>—</w:t>
+            </w:r>
+          </w:p>
+        </w:tc>
+        <w:tc>
+          <w:tcPr>
+            <w:tcW w:type="dxa" w:w="1234"/>
+            <w:shd w:fill="F4F6F7" w:val="clear"/>
+          </w:tcPr>
+          <w:p>
+            <w:r>
+              <w:rPr>
+                <w:sz w:val="18"/>
+              </w:rPr>
+            </w:r>
+            <w:r>
+              <w:rPr>
+                <w:sz w:val="18"/>
+              </w:rPr>
+              <w:t>strokes bound</w:t>
+            </w:r>
+          </w:p>
+        </w:tc>
+      </w:tr>
+      <w:tr>
+        <w:tc>
+          <w:tcPr>
+            <w:tcW w:type="dxa" w:w="1234"/>
+          </w:tcPr>
+          <w:p>
+            <w:r>
+              <w:rPr>
+                <w:sz w:val="18"/>
+              </w:rPr>
+            </w:r>
+            <w:r>
+              <w:rPr>
+                <w:sz w:val="18"/>
+              </w:rPr>
+              <w:t>Product image</w:t>
+            </w:r>
+          </w:p>
+        </w:tc>
+        <w:tc>
+          <w:tcPr>
+            <w:tcW w:type="dxa" w:w="1234"/>
+          </w:tcPr>
+          <w:p>
+            <w:r>
+              <w:rPr>
+                <w:sz w:val="18"/>
+              </w:rPr>
+            </w:r>
+            <w:r>
+              <w:rPr>
+                <w:sz w:val="18"/>
+              </w:rPr>
+              <w:t>274×274</w:t>
+            </w:r>
+          </w:p>
+        </w:tc>
+        <w:tc>
+          <w:tcPr>
+            <w:tcW w:type="dxa" w:w="1234"/>
+          </w:tcPr>
+          <w:p>
+            <w:r>
+              <w:rPr>
+                <w:sz w:val="18"/>
+              </w:rPr>
+            </w:r>
+            <w:r>
+              <w:rPr>
+                <w:sz w:val="18"/>
+              </w:rPr>
+              <w:t>—</w:t>
+            </w:r>
+          </w:p>
+        </w:tc>
+        <w:tc>
+          <w:tcPr>
+            <w:tcW w:type="dxa" w:w="1234"/>
+          </w:tcPr>
+          <w:p>
+            <w:r>
+              <w:rPr>
+                <w:sz w:val="18"/>
+              </w:rPr>
+            </w:r>
+            <w:r>
+              <w:rPr>
+                <w:sz w:val="18"/>
+              </w:rPr>
+              <w:t>image fill</w:t>
+            </w:r>
+          </w:p>
+        </w:tc>
+        <w:tc>
+          <w:tcPr>
+            <w:tcW w:type="dxa" w:w="1234"/>
+          </w:tcPr>
+          <w:p>
+            <w:r>
+              <w:rPr>
+                <w:sz w:val="18"/>
+              </w:rPr>
+            </w:r>
+            <w:r>
+              <w:rPr>
+                <w:sz w:val="18"/>
+              </w:rPr>
+              <w:t>—</w:t>
+            </w:r>
+          </w:p>
+        </w:tc>
+        <w:tc>
+          <w:tcPr>
+            <w:tcW w:type="dxa" w:w="1234"/>
+          </w:tcPr>
+          <w:p>
+            <w:r>
+              <w:rPr>
+                <w:sz w:val="18"/>
+              </w:rPr>
+            </w:r>
+            <w:r>
+              <w:rPr>
+                <w:sz w:val="18"/>
+              </w:rPr>
+              <w:t>—</w:t>
+            </w:r>
+          </w:p>
+        </w:tc>
+        <w:tc>
+          <w:tcPr>
+            <w:tcW w:type="dxa" w:w="1234"/>
+          </w:tcPr>
+          <w:p>
+            <w:r>
+              <w:rPr>
+                <w:sz w:val="18"/>
+              </w:rPr>
+            </w:r>
+            <w:r>
+              <w:rPr>
+                <w:sz w:val="18"/>
+              </w:rPr>
+              <w:t>—</w:t>
+            </w:r>
+          </w:p>
+        </w:tc>
+      </w:tr>
+      <w:tr>
+        <w:tc>
+          <w:tcPr>
+            <w:tcW w:type="dxa" w:w="1234"/>
+            <w:shd w:fill="F4F6F7" w:val="clear"/>
+          </w:tcPr>
+          <w:p>
+            <w:r>
+              <w:rPr>
+                <w:sz w:val="18"/>
+              </w:rPr>
+            </w:r>
+            <w:r>
+              <w:rPr>
+                <w:sz w:val="18"/>
+              </w:rPr>
+              <w:t>Hover image (overlay)</w:t>
+            </w:r>
+          </w:p>
+        </w:tc>
+        <w:tc>
+          <w:tcPr>
+            <w:tcW w:type="dxa" w:w="1234"/>
+            <w:shd w:fill="F4F6F7" w:val="clear"/>
+          </w:tcPr>
+          <w:p>
+            <w:r>
+              <w:rPr>
+                <w:sz w:val="18"/>
+              </w:rPr>
+            </w:r>
+            <w:r>
+              <w:rPr>
+                <w:sz w:val="18"/>
+              </w:rPr>
+              <w:t>274×274</w:t>
+            </w:r>
+          </w:p>
+        </w:tc>
+        <w:tc>
+          <w:tcPr>
+            <w:tcW w:type="dxa" w:w="1234"/>
+            <w:shd w:fill="F4F6F7" w:val="clear"/>
+          </w:tcPr>
+          <w:p>
+            <w:r>
+              <w:rPr>
+                <w:sz w:val="18"/>
+              </w:rPr>
+            </w:r>
+            <w:r>
+              <w:rPr>
+                <w:sz w:val="18"/>
+              </w:rPr>
+              <w:t>—</w:t>
+            </w:r>
+          </w:p>
+        </w:tc>
+        <w:tc>
+          <w:tcPr>
+            <w:tcW w:type="dxa" w:w="1234"/>
+            <w:shd w:fill="F4F6F7" w:val="clear"/>
+          </w:tcPr>
+          <w:p>
+            <w:r>
+              <w:rPr>
+                <w:sz w:val="18"/>
+              </w:rPr>
+            </w:r>
+            <w:r>
+              <w:rPr>
+                <w:sz w:val="18"/>
+              </w:rPr>
+              <w:t>#FFFFFF, opacity 0</w:t>
+            </w:r>
+          </w:p>
+        </w:tc>
+        <w:tc>
+          <w:tcPr>
+            <w:tcW w:type="dxa" w:w="1234"/>
+            <w:shd w:fill="F4F6F7" w:val="clear"/>
+          </w:tcPr>
+          <w:p>
+            <w:r>
+              <w:rPr>
+                <w:sz w:val="18"/>
+              </w:rPr>
+            </w:r>
+            <w:r>
+              <w:rPr>
+                <w:sz w:val="18"/>
+              </w:rPr>
+              <w:t>—</w:t>
+            </w:r>
+          </w:p>
+        </w:tc>
+        <w:tc>
+          <w:tcPr>
+            <w:tcW w:type="dxa" w:w="1234"/>
+            <w:shd w:fill="F4F6F7" w:val="clear"/>
+          </w:tcPr>
+          <w:p>
+            <w:r>
+              <w:rPr>
+                <w:sz w:val="18"/>
+              </w:rPr>
+            </w:r>
+            <w:r>
+              <w:rPr>
+                <w:sz w:val="18"/>
+              </w:rPr>
+              <w:t>—</w:t>
+            </w:r>
+          </w:p>
+        </w:tc>
+        <w:tc>
+          <w:tcPr>
+            <w:tcW w:type="dxa" w:w="1234"/>
+            <w:shd w:fill="F4F6F7" w:val="clear"/>
+          </w:tcPr>
+          <w:p>
+            <w:r>
+              <w:rPr>
+                <w:sz w:val="18"/>
+              </w:rPr>
+            </w:r>
+            <w:r>
+              <w:rPr>
+                <w:sz w:val="18"/>
+              </w:rPr>
+              <w:t>—</w:t>
+            </w:r>
+          </w:p>
+        </w:tc>
+      </w:tr>
+      <w:tr>
+        <w:tc>
+          <w:tcPr>
+            <w:tcW w:type="dxa" w:w="1234"/>
+          </w:tcPr>
+          <w:p>
+            <w:r>
+              <w:rPr>
+                <w:sz w:val="18"/>
+              </w:rPr>
+            </w:r>
+            <w:r>
+              <w:rPr>
+                <w:sz w:val="18"/>
+              </w:rPr>
+              <w:t>Wishlist heart</w:t>
+            </w:r>
+          </w:p>
+        </w:tc>
+        <w:tc>
+          <w:tcPr>
+            <w:tcW w:type="dxa" w:w="1234"/>
+          </w:tcPr>
+          <w:p>
+            <w:r>
+              <w:rPr>
+                <w:sz w:val="18"/>
+              </w:rPr>
+            </w:r>
+            <w:r>
+              <w:rPr>
+                <w:sz w:val="18"/>
+              </w:rPr>
+              <w:t>32×32</w:t>
+            </w:r>
+          </w:p>
+        </w:tc>
+        <w:tc>
+          <w:tcPr>
+            <w:tcW w:type="dxa" w:w="1234"/>
+          </w:tcPr>
+          <w:p>
+            <w:r>
+              <w:rPr>
+                <w:sz w:val="18"/>
+              </w:rPr>
+            </w:r>
+            <w:r>
+              <w:rPr>
+                <w:sz w:val="18"/>
+              </w:rPr>
+              <w:t>—</w:t>
+            </w:r>
+          </w:p>
+        </w:tc>
+        <w:tc>
+          <w:tcPr>
+            <w:tcW w:type="dxa" w:w="1234"/>
+          </w:tcPr>
+          <w:p>
+            <w:r>
+              <w:rPr>
+                <w:sz w:val="18"/>
+              </w:rPr>
+            </w:r>
+            <w:r>
+              <w:rPr>
+                <w:sz w:val="18"/>
+              </w:rPr>
+              <w:t>#FFFFFF</w:t>
+            </w:r>
+          </w:p>
+        </w:tc>
+        <w:tc>
+          <w:tcPr>
+            <w:tcW w:type="dxa" w:w="1234"/>
+          </w:tcPr>
+          <w:p>
+            <w:r>
+              <w:rPr>
+                <w:sz w:val="18"/>
+              </w:rPr>
+            </w:r>
+            <w:r>
+              <w:rPr>
+                <w:sz w:val="18"/>
+              </w:rPr>
+              <w:t>—</w:t>
+            </w:r>
+          </w:p>
+        </w:tc>
+        <w:tc>
+          <w:tcPr>
+            <w:tcW w:type="dxa" w:w="1234"/>
+          </w:tcPr>
+          <w:p>
+            <w:r>
+              <w:rPr>
+                <w:sz w:val="18"/>
+              </w:rPr>
+            </w:r>
+            <w:r>
+              <w:rPr>
+                <w:sz w:val="18"/>
+              </w:rPr>
+              <w:t>—</w:t>
+            </w:r>
+          </w:p>
+        </w:tc>
+        <w:tc>
+          <w:tcPr>
+            <w:tcW w:type="dxa" w:w="1234"/>
+          </w:tcPr>
+          <w:p>
+            <w:r>
+              <w:rPr>
+                <w:sz w:val="18"/>
+              </w:rPr>
+            </w:r>
+            <w:r>
+              <w:rPr>
+                <w:sz w:val="18"/>
+              </w:rPr>
+              <w:t>—</w:t>
+            </w:r>
+          </w:p>
+        </w:tc>
+      </w:tr>
+      <w:tr>
+        <w:tc>
+          <w:tcPr>
+            <w:tcW w:type="dxa" w:w="1234"/>
+            <w:shd w:fill="F4F6F7" w:val="clear"/>
+          </w:tcPr>
+          <w:p>
+            <w:r>
+              <w:rPr>
+                <w:sz w:val="18"/>
+              </w:rPr>
+            </w:r>
+            <w:r>
+              <w:rPr>
+                <w:sz w:val="18"/>
+              </w:rPr>
+              <w:t>Badge "NEW" tag</w:t>
+            </w:r>
+          </w:p>
+        </w:tc>
+        <w:tc>
+          <w:tcPr>
+            <w:tcW w:type="dxa" w:w="1234"/>
+            <w:shd w:fill="F4F6F7" w:val="clear"/>
+          </w:tcPr>
+          <w:p>
+            <w:r>
+              <w:rPr>
+                <w:sz w:val="18"/>
+              </w:rPr>
+            </w:r>
+            <w:r>
+              <w:rPr>
+                <w:sz w:val="18"/>
+              </w:rPr>
+              <w:t>49×25</w:t>
+            </w:r>
+          </w:p>
+        </w:tc>
+        <w:tc>
+          <w:tcPr>
+            <w:tcW w:type="dxa" w:w="1234"/>
+            <w:shd w:fill="F4F6F7" w:val="clear"/>
+          </w:tcPr>
+          <w:p>
+            <w:r>
+              <w:rPr>
+                <w:sz w:val="18"/>
+              </w:rPr>
+            </w:r>
+            <w:r>
+              <w:rPr>
+                <w:sz w:val="18"/>
+              </w:rPr>
+              <w:t>—</w:t>
+            </w:r>
+          </w:p>
+        </w:tc>
+        <w:tc>
+          <w:tcPr>
+            <w:tcW w:type="dxa" w:w="1234"/>
+            <w:shd w:fill="F4F6F7" w:val="clear"/>
+          </w:tcPr>
+          <w:p>
+            <w:r>
+              <w:rPr>
+                <w:sz w:val="18"/>
+              </w:rPr>
+            </w:r>
+            <w:r>
+              <w:rPr>
+                <w:sz w:val="18"/>
+              </w:rPr>
+              <w:t>fill #00B451</w:t>
+            </w:r>
+          </w:p>
+        </w:tc>
+        <w:tc>
+          <w:tcPr>
+            <w:tcW w:type="dxa" w:w="1234"/>
+            <w:shd w:fill="F4F6F7" w:val="clear"/>
+          </w:tcPr>
+          <w:p>
+            <w:r>
+              <w:rPr>
+                <w:sz w:val="18"/>
+              </w:rPr>
+            </w:r>
+            <w:r>
+              <w:rPr>
+                <w:sz w:val="18"/>
+              </w:rPr>
+              <w:t>radius 6</w:t>
+            </w:r>
+          </w:p>
+        </w:tc>
+        <w:tc>
+          <w:tcPr>
+            <w:tcW w:type="dxa" w:w="1234"/>
+            <w:shd w:fill="F4F6F7" w:val="clear"/>
+          </w:tcPr>
+          <w:p>
+            <w:r>
+              <w:rPr>
+                <w:sz w:val="18"/>
+              </w:rPr>
+            </w:r>
+            <w:r>
+              <w:rPr>
+                <w:sz w:val="18"/>
+              </w:rPr>
+              <w:t>pad 12/4, gap 10</w:t>
+            </w:r>
+          </w:p>
+        </w:tc>
+        <w:tc>
+          <w:tcPr>
+            <w:tcW w:type="dxa" w:w="1234"/>
+            <w:shd w:fill="F4F6F7" w:val="clear"/>
+          </w:tcPr>
+          <w:p>
+            <w:r>
+              <w:rPr>
+                <w:sz w:val="18"/>
+              </w:rPr>
+            </w:r>
+            <w:r>
+              <w:rPr>
+                <w:sz w:val="18"/>
+              </w:rPr>
+              <w:t>VariableID:4:1285</w:t>
+            </w:r>
+          </w:p>
+        </w:tc>
+      </w:tr>
+      <w:tr>
+        <w:tc>
+          <w:tcPr>
+            <w:tcW w:type="dxa" w:w="1234"/>
+          </w:tcPr>
+          <w:p>
+            <w:r>
+              <w:rPr>
+                <w:sz w:val="18"/>
+              </w:rPr>
+            </w:r>
+            <w:r>
+              <w:rPr>
+                <w:sz w:val="18"/>
+              </w:rPr>
+              <w:t>Badge "NEW" label</w:t>
+            </w:r>
+          </w:p>
+        </w:tc>
+        <w:tc>
+          <w:tcPr>
+            <w:tcW w:type="dxa" w:w="1234"/>
+          </w:tcPr>
+          <w:p>
+            <w:r>
+              <w:rPr>
+                <w:sz w:val="18"/>
+              </w:rPr>
+            </w:r>
+            <w:r>
+              <w:rPr>
+                <w:sz w:val="18"/>
+              </w:rPr>
+              <w:t>25×15</w:t>
+            </w:r>
+          </w:p>
+        </w:tc>
+        <w:tc>
+          <w:tcPr>
+            <w:tcW w:type="dxa" w:w="1234"/>
+          </w:tcPr>
+          <w:p>
+            <w:r>
+              <w:rPr>
+                <w:sz w:val="18"/>
+              </w:rPr>
+            </w:r>
+            <w:r>
+              <w:rPr>
+                <w:sz w:val="18"/>
+              </w:rPr>
+              <w:t>500 12/14</w:t>
+            </w:r>
+          </w:p>
+        </w:tc>
+        <w:tc>
+          <w:tcPr>
+            <w:tcW w:type="dxa" w:w="1234"/>
+          </w:tcPr>
+          <w:p>
+            <w:r>
+              <w:rPr>
+                <w:sz w:val="18"/>
+              </w:rPr>
+            </w:r>
+            <w:r>
+              <w:rPr>
+                <w:sz w:val="18"/>
+              </w:rPr>
+              <w:t>#000000</w:t>
+            </w:r>
+          </w:p>
+        </w:tc>
+        <w:tc>
+          <w:tcPr>
+            <w:tcW w:type="dxa" w:w="1234"/>
+          </w:tcPr>
+          <w:p>
+            <w:r>
+              <w:rPr>
+                <w:sz w:val="18"/>
+              </w:rPr>
+            </w:r>
+            <w:r>
+              <w:rPr>
+                <w:sz w:val="18"/>
+              </w:rPr>
+              <w:t>—</w:t>
+            </w:r>
+          </w:p>
+        </w:tc>
+        <w:tc>
+          <w:tcPr>
+            <w:tcW w:type="dxa" w:w="1234"/>
+          </w:tcPr>
+          <w:p>
+            <w:r>
+              <w:rPr>
+                <w:sz w:val="18"/>
+              </w:rPr>
+            </w:r>
+            <w:r>
+              <w:rPr>
+                <w:sz w:val="18"/>
+              </w:rPr>
+              <w:t>—</w:t>
+            </w:r>
+          </w:p>
+        </w:tc>
+        <w:tc>
+          <w:tcPr>
+            <w:tcW w:type="dxa" w:w="1234"/>
+          </w:tcPr>
+          <w:p>
+            <w:r>
+              <w:rPr>
+                <w:sz w:val="18"/>
+              </w:rPr>
+            </w:r>
+            <w:r>
+              <w:rPr>
+                <w:sz w:val="18"/>
+              </w:rPr>
+              <w:t>VariableID:4:1270</w:t>
+            </w:r>
+          </w:p>
+        </w:tc>
+      </w:tr>
+      <w:tr>
+        <w:tc>
+          <w:tcPr>
+            <w:tcW w:type="dxa" w:w="1234"/>
+            <w:shd w:fill="F4F6F7" w:val="clear"/>
+          </w:tcPr>
+          <w:p>
+            <w:r>
+              <w:rPr>
+                <w:sz w:val="18"/>
+              </w:rPr>
+            </w:r>
+            <w:r>
+              <w:rPr>
+                <w:sz w:val="18"/>
+              </w:rPr>
+              <w:t>Badge "Almost Gone" tag</w:t>
+            </w:r>
+          </w:p>
+        </w:tc>
+        <w:tc>
+          <w:tcPr>
+            <w:tcW w:type="dxa" w:w="1234"/>
+            <w:shd w:fill="F4F6F7" w:val="clear"/>
+          </w:tcPr>
+          <w:p>
+            <w:r>
+              <w:rPr>
+                <w:sz w:val="18"/>
+              </w:rPr>
+            </w:r>
+            <w:r>
+              <w:rPr>
+                <w:sz w:val="18"/>
+              </w:rPr>
+              <w:t>103×25</w:t>
+            </w:r>
+          </w:p>
+        </w:tc>
+        <w:tc>
+          <w:tcPr>
+            <w:tcW w:type="dxa" w:w="1234"/>
+            <w:shd w:fill="F4F6F7" w:val="clear"/>
+          </w:tcPr>
+          <w:p>
+            <w:r>
+              <w:rPr>
+                <w:sz w:val="18"/>
+              </w:rPr>
+            </w:r>
+            <w:r>
+              <w:rPr>
+                <w:sz w:val="18"/>
+              </w:rPr>
+              <w:t>—</w:t>
+            </w:r>
+          </w:p>
+        </w:tc>
+        <w:tc>
+          <w:tcPr>
+            <w:tcW w:type="dxa" w:w="1234"/>
+            <w:shd w:fill="F4F6F7" w:val="clear"/>
+          </w:tcPr>
+          <w:p>
+            <w:r>
+              <w:rPr>
+                <w:sz w:val="18"/>
+              </w:rPr>
+            </w:r>
+            <w:r>
+              <w:rPr>
+                <w:sz w:val="18"/>
+              </w:rPr>
+              <w:t>fill #F7BE00</w:t>
+            </w:r>
+          </w:p>
+        </w:tc>
+        <w:tc>
+          <w:tcPr>
+            <w:tcW w:type="dxa" w:w="1234"/>
+            <w:shd w:fill="F4F6F7" w:val="clear"/>
+          </w:tcPr>
+          <w:p>
+            <w:r>
+              <w:rPr>
+                <w:sz w:val="18"/>
+              </w:rPr>
+            </w:r>
+            <w:r>
+              <w:rPr>
+                <w:sz w:val="18"/>
+              </w:rPr>
+              <w:t>radius 6</w:t>
+            </w:r>
+          </w:p>
+        </w:tc>
+        <w:tc>
+          <w:tcPr>
+            <w:tcW w:type="dxa" w:w="1234"/>
+            <w:shd w:fill="F4F6F7" w:val="clear"/>
+          </w:tcPr>
+          <w:p>
+            <w:r>
+              <w:rPr>
+                <w:sz w:val="18"/>
+              </w:rPr>
+            </w:r>
+            <w:r>
+              <w:rPr>
+                <w:sz w:val="18"/>
+              </w:rPr>
+              <w:t>pad 12/4</w:t>
+            </w:r>
+          </w:p>
+        </w:tc>
+        <w:tc>
+          <w:tcPr>
+            <w:tcW w:type="dxa" w:w="1234"/>
+            <w:shd w:fill="F4F6F7" w:val="clear"/>
+          </w:tcPr>
+          <w:p>
+            <w:r>
+              <w:rPr>
+                <w:sz w:val="18"/>
+              </w:rPr>
+            </w:r>
+            <w:r>
+              <w:rPr>
+                <w:sz w:val="18"/>
+              </w:rPr>
+              <w:t>VariableID:696:36474</w:t>
+            </w:r>
+          </w:p>
+        </w:tc>
+      </w:tr>
+      <w:tr>
+        <w:tc>
+          <w:tcPr>
+            <w:tcW w:type="dxa" w:w="1234"/>
+          </w:tcPr>
+          <w:p>
+            <w:r>
+              <w:rPr>
+                <w:sz w:val="18"/>
+              </w:rPr>
+            </w:r>
+            <w:r>
+              <w:rPr>
+                <w:sz w:val="18"/>
+              </w:rPr>
+              <w:t>Badge "Almost Gone" label</w:t>
+            </w:r>
+          </w:p>
+        </w:tc>
+        <w:tc>
+          <w:tcPr>
+            <w:tcW w:type="dxa" w:w="1234"/>
+          </w:tcPr>
+          <w:p>
+            <w:r>
+              <w:rPr>
+                <w:sz w:val="18"/>
+              </w:rPr>
+            </w:r>
+            <w:r>
+              <w:rPr>
+                <w:sz w:val="18"/>
+              </w:rPr>
+              <w:t>79×15</w:t>
+            </w:r>
+          </w:p>
+        </w:tc>
+        <w:tc>
+          <w:tcPr>
+            <w:tcW w:type="dxa" w:w="1234"/>
+          </w:tcPr>
+          <w:p>
+            <w:r>
+              <w:rPr>
+                <w:sz w:val="18"/>
+              </w:rPr>
+            </w:r>
+            <w:r>
+              <w:rPr>
+                <w:sz w:val="18"/>
+              </w:rPr>
+              <w:t>500 12/14</w:t>
+            </w:r>
+          </w:p>
+        </w:tc>
+        <w:tc>
+          <w:tcPr>
+            <w:tcW w:type="dxa" w:w="1234"/>
+          </w:tcPr>
+          <w:p>
+            <w:r>
+              <w:rPr>
+                <w:sz w:val="18"/>
+              </w:rPr>
+            </w:r>
+            <w:r>
+              <w:rPr>
+                <w:sz w:val="18"/>
+              </w:rPr>
+              <w:t>#2D2E33</w:t>
+            </w:r>
+          </w:p>
+        </w:tc>
+        <w:tc>
+          <w:tcPr>
+            <w:tcW w:type="dxa" w:w="1234"/>
+          </w:tcPr>
+          <w:p>
+            <w:r>
+              <w:rPr>
+                <w:sz w:val="18"/>
+              </w:rPr>
+            </w:r>
+            <w:r>
+              <w:rPr>
+                <w:sz w:val="18"/>
+              </w:rPr>
+              <w:t>—</w:t>
+            </w:r>
+          </w:p>
+        </w:tc>
+        <w:tc>
+          <w:tcPr>
+            <w:tcW w:type="dxa" w:w="1234"/>
+          </w:tcPr>
+          <w:p>
+            <w:r>
+              <w:rPr>
+                <w:sz w:val="18"/>
+              </w:rPr>
+            </w:r>
+            <w:r>
+              <w:rPr>
+                <w:sz w:val="18"/>
+              </w:rPr>
+              <w:t>—</w:t>
+            </w:r>
+          </w:p>
+        </w:tc>
+        <w:tc>
+          <w:tcPr>
+            <w:tcW w:type="dxa" w:w="1234"/>
+          </w:tcPr>
+          <w:p>
+            <w:r>
+              <w:rPr>
+                <w:sz w:val="18"/>
+              </w:rPr>
+            </w:r>
+            <w:r>
+              <w:rPr>
+                <w:sz w:val="18"/>
+              </w:rPr>
+              <w:t>VariableID:4:1271</w:t>
+            </w:r>
+          </w:p>
+        </w:tc>
+      </w:tr>
+      <w:tr>
+        <w:tc>
+          <w:tcPr>
+            <w:tcW w:type="dxa" w:w="1234"/>
+            <w:shd w:fill="F4F6F7" w:val="clear"/>
+          </w:tcPr>
+          <w:p>
+            <w:r>
+              <w:rPr>
+                <w:sz w:val="18"/>
+              </w:rPr>
+            </w:r>
+            <w:r>
+              <w:rPr>
+                <w:sz w:val="18"/>
+              </w:rPr>
+              <w:t>Add to Cart (primary)</w:t>
+            </w:r>
+          </w:p>
+        </w:tc>
+        <w:tc>
+          <w:tcPr>
+            <w:tcW w:type="dxa" w:w="1234"/>
+            <w:shd w:fill="F4F6F7" w:val="clear"/>
+          </w:tcPr>
+          <w:p>
+            <w:r>
+              <w:rPr>
+                <w:sz w:val="18"/>
+              </w:rPr>
+            </w:r>
+            <w:r>
+              <w:rPr>
+                <w:sz w:val="18"/>
+              </w:rPr>
+              <w:t>137×36</w:t>
+            </w:r>
+          </w:p>
+        </w:tc>
+        <w:tc>
+          <w:tcPr>
+            <w:tcW w:type="dxa" w:w="1234"/>
+            <w:shd w:fill="F4F6F7" w:val="clear"/>
+          </w:tcPr>
+          <w:p>
+            <w:r>
+              <w:rPr>
+                <w:sz w:val="18"/>
+              </w:rPr>
+            </w:r>
+            <w:r>
+              <w:rPr>
+                <w:sz w:val="18"/>
+              </w:rPr>
+              <w:t>—</w:t>
+            </w:r>
+          </w:p>
+        </w:tc>
+        <w:tc>
+          <w:tcPr>
+            <w:tcW w:type="dxa" w:w="1234"/>
+            <w:shd w:fill="F4F6F7" w:val="clear"/>
+          </w:tcPr>
+          <w:p>
+            <w:r>
+              <w:rPr>
+                <w:sz w:val="18"/>
+              </w:rPr>
+            </w:r>
+            <w:r>
+              <w:rPr>
+                <w:sz w:val="18"/>
+              </w:rPr>
+              <w:t>fill #D9F3E3</w:t>
+            </w:r>
+          </w:p>
+        </w:tc>
+        <w:tc>
+          <w:tcPr>
+            <w:tcW w:type="dxa" w:w="1234"/>
+            <w:shd w:fill="F4F6F7" w:val="clear"/>
+          </w:tcPr>
+          <w:p>
+            <w:r>
+              <w:rPr>
+                <w:sz w:val="18"/>
+              </w:rPr>
+            </w:r>
+            <w:r>
+              <w:rPr>
+                <w:sz w:val="18"/>
+              </w:rPr>
+              <w:t>stroke #98DEB3, radius 8</w:t>
+            </w:r>
+          </w:p>
+        </w:tc>
+        <w:tc>
+          <w:tcPr>
+            <w:tcW w:type="dxa" w:w="1234"/>
+            <w:shd w:fill="F4F6F7" w:val="clear"/>
+          </w:tcPr>
+          <w:p>
+            <w:r>
+              <w:rPr>
+                <w:sz w:val="18"/>
+              </w:rPr>
+            </w:r>
+            <w:r>
+              <w:rPr>
+                <w:sz w:val="18"/>
+              </w:rPr>
+              <w:t>pad 16/8, gap 4</w:t>
+            </w:r>
+          </w:p>
+        </w:tc>
+        <w:tc>
+          <w:tcPr>
+            <w:tcW w:type="dxa" w:w="1234"/>
+            <w:shd w:fill="F4F6F7" w:val="clear"/>
+          </w:tcPr>
+          <w:p>
+            <w:r>
+              <w:rPr>
+                <w:sz w:val="18"/>
+              </w:rPr>
+            </w:r>
+            <w:r>
+              <w:rPr>
+                <w:sz w:val="18"/>
+              </w:rPr>
+              <w:t>VariableID:3702:114502</w:t>
+            </w:r>
+          </w:p>
+        </w:tc>
+      </w:tr>
+      <w:tr>
+        <w:tc>
+          <w:tcPr>
+            <w:tcW w:type="dxa" w:w="1234"/>
+          </w:tcPr>
+          <w:p>
+            <w:r>
+              <w:rPr>
+                <w:sz w:val="18"/>
+              </w:rPr>
+            </w:r>
+            <w:r>
+              <w:rPr>
+                <w:sz w:val="18"/>
+              </w:rPr>
+              <w:t>Add to Cart label</w:t>
+            </w:r>
+          </w:p>
+        </w:tc>
+        <w:tc>
+          <w:tcPr>
+            <w:tcW w:type="dxa" w:w="1234"/>
+          </w:tcPr>
+          <w:p>
+            <w:r>
+              <w:rPr>
+                <w:sz w:val="18"/>
+              </w:rPr>
+            </w:r>
+            <w:r>
+              <w:rPr>
+                <w:sz w:val="18"/>
+              </w:rPr>
+              <w:t>85×19</w:t>
+            </w:r>
+          </w:p>
+        </w:tc>
+        <w:tc>
+          <w:tcPr>
+            <w:tcW w:type="dxa" w:w="1234"/>
+          </w:tcPr>
+          <w:p>
+            <w:r>
+              <w:rPr>
+                <w:sz w:val="18"/>
+              </w:rPr>
+            </w:r>
+            <w:r>
+              <w:rPr>
+                <w:sz w:val="18"/>
+              </w:rPr>
+              <w:t>500 14/18</w:t>
+            </w:r>
+          </w:p>
+        </w:tc>
+        <w:tc>
+          <w:tcPr>
+            <w:tcW w:type="dxa" w:w="1234"/>
+          </w:tcPr>
+          <w:p>
+            <w:r>
+              <w:rPr>
+                <w:sz w:val="18"/>
+              </w:rPr>
+            </w:r>
+            <w:r>
+              <w:rPr>
+                <w:sz w:val="18"/>
+              </w:rPr>
+              <w:t>#005640</w:t>
+            </w:r>
+          </w:p>
+        </w:tc>
+        <w:tc>
+          <w:tcPr>
+            <w:tcW w:type="dxa" w:w="1234"/>
+          </w:tcPr>
+          <w:p>
+            <w:r>
+              <w:rPr>
+                <w:sz w:val="18"/>
+              </w:rPr>
+            </w:r>
+            <w:r>
+              <w:rPr>
+                <w:sz w:val="18"/>
+              </w:rPr>
+              <w:t>—</w:t>
+            </w:r>
+          </w:p>
+        </w:tc>
+        <w:tc>
+          <w:tcPr>
+            <w:tcW w:type="dxa" w:w="1234"/>
+          </w:tcPr>
+          <w:p>
+            <w:r>
+              <w:rPr>
+                <w:sz w:val="18"/>
+              </w:rPr>
+            </w:r>
+            <w:r>
+              <w:rPr>
+                <w:sz w:val="18"/>
+              </w:rPr>
+              <w:t>—</w:t>
+            </w:r>
+          </w:p>
+        </w:tc>
+        <w:tc>
+          <w:tcPr>
+            <w:tcW w:type="dxa" w:w="1234"/>
+          </w:tcPr>
+          <w:p>
+            <w:r>
+              <w:rPr>
+                <w:sz w:val="18"/>
+              </w:rPr>
+            </w:r>
+            <w:r>
+              <w:rPr>
+                <w:sz w:val="18"/>
+              </w:rPr>
+              <w:t>VariableID:225:5670</w:t>
+            </w:r>
+          </w:p>
+        </w:tc>
+      </w:tr>
+      <w:tr>
+        <w:tc>
+          <w:tcPr>
+            <w:tcW w:type="dxa" w:w="1234"/>
+            <w:shd w:fill="F4F6F7" w:val="clear"/>
+          </w:tcPr>
+          <w:p>
+            <w:r>
+              <w:rPr>
+                <w:sz w:val="18"/>
+              </w:rPr>
+            </w:r>
+            <w:r>
+              <w:rPr>
+                <w:sz w:val="18"/>
+              </w:rPr>
+              <w:t>Add to Cart icon</w:t>
+            </w:r>
+          </w:p>
+        </w:tc>
+        <w:tc>
+          <w:tcPr>
+            <w:tcW w:type="dxa" w:w="1234"/>
+            <w:shd w:fill="F4F6F7" w:val="clear"/>
+          </w:tcPr>
+          <w:p>
+            <w:r>
+              <w:rPr>
+                <w:sz w:val="18"/>
+              </w:rPr>
+            </w:r>
+            <w:r>
+              <w:rPr>
+                <w:sz w:val="18"/>
+              </w:rPr>
+              <w:t>13×12</w:t>
+            </w:r>
+          </w:p>
+        </w:tc>
+        <w:tc>
+          <w:tcPr>
+            <w:tcW w:type="dxa" w:w="1234"/>
+            <w:shd w:fill="F4F6F7" w:val="clear"/>
+          </w:tcPr>
+          <w:p>
+            <w:r>
+              <w:rPr>
+                <w:sz w:val="18"/>
+              </w:rPr>
+            </w:r>
+            <w:r>
+              <w:rPr>
+                <w:sz w:val="18"/>
+              </w:rPr>
+              <w:t>—</w:t>
+            </w:r>
+          </w:p>
+        </w:tc>
+        <w:tc>
+          <w:tcPr>
+            <w:tcW w:type="dxa" w:w="1234"/>
+            <w:shd w:fill="F4F6F7" w:val="clear"/>
+          </w:tcPr>
+          <w:p>
+            <w:r>
+              <w:rPr>
+                <w:sz w:val="18"/>
+              </w:rPr>
+            </w:r>
+            <w:r>
+              <w:rPr>
+                <w:sz w:val="18"/>
+              </w:rPr>
+              <w:t>#005640</w:t>
+            </w:r>
+          </w:p>
+        </w:tc>
+        <w:tc>
+          <w:tcPr>
+            <w:tcW w:type="dxa" w:w="1234"/>
+            <w:shd w:fill="F4F6F7" w:val="clear"/>
+          </w:tcPr>
+          <w:p>
+            <w:r>
+              <w:rPr>
+                <w:sz w:val="18"/>
+              </w:rPr>
+            </w:r>
+            <w:r>
+              <w:rPr>
+                <w:sz w:val="18"/>
+              </w:rPr>
+              <w:t>—</w:t>
+            </w:r>
+          </w:p>
+        </w:tc>
+        <w:tc>
+          <w:tcPr>
+            <w:tcW w:type="dxa" w:w="1234"/>
+            <w:shd w:fill="F4F6F7" w:val="clear"/>
+          </w:tcPr>
+          <w:p>
+            <w:r>
+              <w:rPr>
+                <w:sz w:val="18"/>
+              </w:rPr>
+            </w:r>
+            <w:r>
+              <w:rPr>
+                <w:sz w:val="18"/>
+              </w:rPr>
+              <w:t>—</w:t>
+            </w:r>
+          </w:p>
+        </w:tc>
+        <w:tc>
+          <w:tcPr>
+            <w:tcW w:type="dxa" w:w="1234"/>
+            <w:shd w:fill="F4F6F7" w:val="clear"/>
+          </w:tcPr>
+          <w:p>
+            <w:r>
+              <w:rPr>
+                <w:sz w:val="18"/>
+              </w:rPr>
+            </w:r>
+            <w:r>
+              <w:rPr>
+                <w:sz w:val="18"/>
+              </w:rPr>
+              <w:t>VariableID:4:1322</w:t>
+            </w:r>
+          </w:p>
+        </w:tc>
+      </w:tr>
+      <w:tr>
+        <w:tc>
+          <w:tcPr>
+            <w:tcW w:type="dxa" w:w="1234"/>
+          </w:tcPr>
+          <w:p>
+            <w:r>
+              <w:rPr>
+                <w:sz w:val="18"/>
+              </w:rPr>
+            </w:r>
+            <w:r>
+              <w:rPr>
+                <w:sz w:val="18"/>
+              </w:rPr>
+              <w:t>Add to Cart (alt/compact)</w:t>
+            </w:r>
+          </w:p>
+        </w:tc>
+        <w:tc>
+          <w:tcPr>
+            <w:tcW w:type="dxa" w:w="1234"/>
+          </w:tcPr>
+          <w:p>
+            <w:r>
+              <w:rPr>
+                <w:sz w:val="18"/>
+              </w:rPr>
+            </w:r>
+            <w:r>
+              <w:rPr>
+                <w:sz w:val="18"/>
+              </w:rPr>
+              <w:t>48×36</w:t>
+            </w:r>
+          </w:p>
+        </w:tc>
+        <w:tc>
+          <w:tcPr>
+            <w:tcW w:type="dxa" w:w="1234"/>
+          </w:tcPr>
+          <w:p>
+            <w:r>
+              <w:rPr>
+                <w:sz w:val="18"/>
+              </w:rPr>
+            </w:r>
+            <w:r>
+              <w:rPr>
+                <w:sz w:val="18"/>
+              </w:rPr>
+              <w:t>—</w:t>
+            </w:r>
+          </w:p>
+        </w:tc>
+        <w:tc>
+          <w:tcPr>
+            <w:tcW w:type="dxa" w:w="1234"/>
+          </w:tcPr>
+          <w:p>
+            <w:r>
+              <w:rPr>
+                <w:sz w:val="18"/>
+              </w:rPr>
+            </w:r>
+            <w:r>
+              <w:rPr>
+                <w:sz w:val="18"/>
+              </w:rPr>
+              <w:t>fill #F0FAF4</w:t>
+            </w:r>
+          </w:p>
+        </w:tc>
+        <w:tc>
+          <w:tcPr>
+            <w:tcW w:type="dxa" w:w="1234"/>
+          </w:tcPr>
+          <w:p>
+            <w:r>
+              <w:rPr>
+                <w:sz w:val="18"/>
+              </w:rPr>
+            </w:r>
+            <w:r>
+              <w:rPr>
+                <w:sz w:val="18"/>
+              </w:rPr>
+              <w:t>stroke #00AE43, radius 6</w:t>
+            </w:r>
+          </w:p>
+        </w:tc>
+        <w:tc>
+          <w:tcPr>
+            <w:tcW w:type="dxa" w:w="1234"/>
+          </w:tcPr>
+          <w:p>
+            <w:r>
+              <w:rPr>
+                <w:sz w:val="18"/>
+              </w:rPr>
+            </w:r>
+            <w:r>
+              <w:rPr>
+                <w:sz w:val="18"/>
+              </w:rPr>
+              <w:t>pad 16/8</w:t>
+            </w:r>
+          </w:p>
+        </w:tc>
+        <w:tc>
+          <w:tcPr>
+            <w:tcW w:type="dxa" w:w="1234"/>
+          </w:tcPr>
+          <w:p>
+            <w:r>
+              <w:rPr>
+                <w:sz w:val="18"/>
+              </w:rPr>
+            </w:r>
+            <w:r>
+              <w:rPr>
+                <w:sz w:val="18"/>
+              </w:rPr>
+              <w:t>VariableID:700:26263</w:t>
+            </w:r>
+          </w:p>
+        </w:tc>
+      </w:tr>
+      <w:tr>
+        <w:tc>
+          <w:tcPr>
+            <w:tcW w:type="dxa" w:w="1234"/>
+            <w:shd w:fill="F4F6F7" w:val="clear"/>
+          </w:tcPr>
+          <w:p>
+            <w:r>
+              <w:rPr>
+                <w:sz w:val="18"/>
+              </w:rPr>
+            </w:r>
+            <w:r>
+              <w:rPr>
+                <w:sz w:val="18"/>
+              </w:rPr>
+              <w:t>Best Seller banner</w:t>
+            </w:r>
+          </w:p>
+        </w:tc>
+        <w:tc>
+          <w:tcPr>
+            <w:tcW w:type="dxa" w:w="1234"/>
+            <w:shd w:fill="F4F6F7" w:val="clear"/>
+          </w:tcPr>
+          <w:p>
+            <w:r>
+              <w:rPr>
+                <w:sz w:val="18"/>
+              </w:rPr>
+            </w:r>
+            <w:r>
+              <w:rPr>
+                <w:sz w:val="18"/>
+              </w:rPr>
+              <w:t>274×25</w:t>
+            </w:r>
+          </w:p>
+        </w:tc>
+        <w:tc>
+          <w:tcPr>
+            <w:tcW w:type="dxa" w:w="1234"/>
+            <w:shd w:fill="F4F6F7" w:val="clear"/>
+          </w:tcPr>
+          <w:p>
+            <w:r>
+              <w:rPr>
+                <w:sz w:val="18"/>
+              </w:rPr>
+            </w:r>
+            <w:r>
+              <w:rPr>
+                <w:sz w:val="18"/>
+              </w:rPr>
+              <w:t>—</w:t>
+            </w:r>
+          </w:p>
+        </w:tc>
+        <w:tc>
+          <w:tcPr>
+            <w:tcW w:type="dxa" w:w="1234"/>
+            <w:shd w:fill="F4F6F7" w:val="clear"/>
+          </w:tcPr>
+          <w:p>
+            <w:r>
+              <w:rPr>
+                <w:sz w:val="18"/>
+              </w:rPr>
+            </w:r>
+            <w:r>
+              <w:rPr>
+                <w:sz w:val="18"/>
+              </w:rPr>
+              <w:t>fill #5C1F8B</w:t>
+            </w:r>
+          </w:p>
+        </w:tc>
+        <w:tc>
+          <w:tcPr>
+            <w:tcW w:type="dxa" w:w="1234"/>
+            <w:shd w:fill="F4F6F7" w:val="clear"/>
+          </w:tcPr>
+          <w:p>
+            <w:r>
+              <w:rPr>
+                <w:sz w:val="18"/>
+              </w:rPr>
+            </w:r>
+            <w:r>
+              <w:rPr>
+                <w:sz w:val="18"/>
+              </w:rPr>
+              <w:t>—</w:t>
+            </w:r>
+          </w:p>
+        </w:tc>
+        <w:tc>
+          <w:tcPr>
+            <w:tcW w:type="dxa" w:w="1234"/>
+            <w:shd w:fill="F4F6F7" w:val="clear"/>
+          </w:tcPr>
+          <w:p>
+            <w:r>
+              <w:rPr>
+                <w:sz w:val="18"/>
+              </w:rPr>
+            </w:r>
+            <w:r>
+              <w:rPr>
+                <w:sz w:val="18"/>
+              </w:rPr>
+              <w:t>pad 0/4</w:t>
+            </w:r>
+          </w:p>
+        </w:tc>
+        <w:tc>
+          <w:tcPr>
+            <w:tcW w:type="dxa" w:w="1234"/>
+            <w:shd w:fill="F4F6F7" w:val="clear"/>
+          </w:tcPr>
+          <w:p>
+            <w:r>
+              <w:rPr>
+                <w:sz w:val="18"/>
+              </w:rPr>
+            </w:r>
+            <w:r>
+              <w:rPr>
+                <w:sz w:val="18"/>
+              </w:rPr>
+              <w:t>VariableID:45:67</w:t>
+            </w:r>
+          </w:p>
+        </w:tc>
+      </w:tr>
+      <w:tr>
+        <w:tc>
+          <w:tcPr>
+            <w:tcW w:type="dxa" w:w="1234"/>
+          </w:tcPr>
+          <w:p>
+            <w:r>
+              <w:rPr>
+                <w:sz w:val="18"/>
+              </w:rPr>
+            </w:r>
+            <w:r>
+              <w:rPr>
+                <w:sz w:val="18"/>
+              </w:rPr>
+              <w:t>Best Seller label</w:t>
+            </w:r>
+          </w:p>
+        </w:tc>
+        <w:tc>
+          <w:tcPr>
+            <w:tcW w:type="dxa" w:w="1234"/>
+          </w:tcPr>
+          <w:p>
+            <w:r>
+              <w:rPr>
+                <w:sz w:val="18"/>
+              </w:rPr>
+            </w:r>
+            <w:r>
+              <w:rPr>
+                <w:sz w:val="18"/>
+              </w:rPr>
+              <w:t>154×17</w:t>
+            </w:r>
+          </w:p>
+        </w:tc>
+        <w:tc>
+          <w:tcPr>
+            <w:tcW w:type="dxa" w:w="1234"/>
+          </w:tcPr>
+          <w:p>
+            <w:r>
+              <w:rPr>
+                <w:sz w:val="18"/>
+              </w:rPr>
+            </w:r>
+            <w:r>
+              <w:rPr>
+                <w:sz w:val="18"/>
+              </w:rPr>
+              <w:t>500 12/17</w:t>
+            </w:r>
+          </w:p>
+        </w:tc>
+        <w:tc>
+          <w:tcPr>
+            <w:tcW w:type="dxa" w:w="1234"/>
+          </w:tcPr>
+          <w:p>
+            <w:r>
+              <w:rPr>
+                <w:sz w:val="18"/>
+              </w:rPr>
+            </w:r>
+            <w:r>
+              <w:rPr>
+                <w:sz w:val="18"/>
+              </w:rPr>
+              <w:t>#FFFFFF</w:t>
+            </w:r>
+          </w:p>
+        </w:tc>
+        <w:tc>
+          <w:tcPr>
+            <w:tcW w:type="dxa" w:w="1234"/>
+          </w:tcPr>
+          <w:p>
+            <w:r>
+              <w:rPr>
+                <w:sz w:val="18"/>
+              </w:rPr>
+            </w:r>
+            <w:r>
+              <w:rPr>
+                <w:sz w:val="18"/>
+              </w:rPr>
+              <w:t>—</w:t>
+            </w:r>
+          </w:p>
+        </w:tc>
+        <w:tc>
+          <w:tcPr>
+            <w:tcW w:type="dxa" w:w="1234"/>
+          </w:tcPr>
+          <w:p>
+            <w:r>
+              <w:rPr>
+                <w:sz w:val="18"/>
+              </w:rPr>
+            </w:r>
+            <w:r>
+              <w:rPr>
+                <w:sz w:val="18"/>
+              </w:rPr>
+              <w:t>—</w:t>
+            </w:r>
+          </w:p>
+        </w:tc>
+        <w:tc>
+          <w:tcPr>
+            <w:tcW w:type="dxa" w:w="1234"/>
+          </w:tcPr>
+          <w:p>
+            <w:r>
+              <w:rPr>
+                <w:sz w:val="18"/>
+              </w:rPr>
+            </w:r>
+            <w:r>
+              <w:rPr>
+                <w:sz w:val="18"/>
+              </w:rPr>
+              <w:t>—</w:t>
+            </w:r>
+          </w:p>
+        </w:tc>
+      </w:tr>
+      <w:tr>
+        <w:tc>
+          <w:tcPr>
+            <w:tcW w:type="dxa" w:w="1234"/>
+            <w:shd w:fill="F4F6F7" w:val="clear"/>
+          </w:tcPr>
+          <w:p>
+            <w:r>
+              <w:rPr>
+                <w:sz w:val="18"/>
+              </w:rPr>
+            </w:r>
+            <w:r>
+              <w:rPr>
+                <w:sz w:val="18"/>
+              </w:rPr>
+              <w:t>Size swatch (selected)</w:t>
+            </w:r>
+          </w:p>
+        </w:tc>
+        <w:tc>
+          <w:tcPr>
+            <w:tcW w:type="dxa" w:w="1234"/>
+            <w:shd w:fill="F4F6F7" w:val="clear"/>
+          </w:tcPr>
+          <w:p>
+            <w:r>
+              <w:rPr>
+                <w:sz w:val="18"/>
+              </w:rPr>
+            </w:r>
+            <w:r>
+              <w:rPr>
+                <w:sz w:val="18"/>
+              </w:rPr>
+              <w:t>36×24</w:t>
+            </w:r>
+          </w:p>
+        </w:tc>
+        <w:tc>
+          <w:tcPr>
+            <w:tcW w:type="dxa" w:w="1234"/>
+            <w:shd w:fill="F4F6F7" w:val="clear"/>
+          </w:tcPr>
+          <w:p>
+            <w:r>
+              <w:rPr>
+                <w:sz w:val="18"/>
+              </w:rPr>
+            </w:r>
+            <w:r>
+              <w:rPr>
+                <w:sz w:val="18"/>
+              </w:rPr>
+              <w:t>400 12/17</w:t>
+            </w:r>
+          </w:p>
+        </w:tc>
+        <w:tc>
+          <w:tcPr>
+            <w:tcW w:type="dxa" w:w="1234"/>
+            <w:shd w:fill="F4F6F7" w:val="clear"/>
+          </w:tcPr>
+          <w:p>
+            <w:r>
+              <w:rPr>
+                <w:sz w:val="18"/>
+              </w:rPr>
+            </w:r>
+            <w:r>
+              <w:rPr>
+                <w:sz w:val="18"/>
+              </w:rPr>
+              <w:t>fill #D5CA9F, text #2D2E33</w:t>
+            </w:r>
+          </w:p>
+        </w:tc>
+        <w:tc>
+          <w:tcPr>
+            <w:tcW w:type="dxa" w:w="1234"/>
+            <w:shd w:fill="F4F6F7" w:val="clear"/>
+          </w:tcPr>
+          <w:p>
+            <w:r>
+              <w:rPr>
+                <w:sz w:val="18"/>
+              </w:rPr>
+            </w:r>
+            <w:r>
+              <w:rPr>
+                <w:sz w:val="18"/>
+              </w:rPr>
+              <w:t>—</w:t>
+            </w:r>
+          </w:p>
+        </w:tc>
+        <w:tc>
+          <w:tcPr>
+            <w:tcW w:type="dxa" w:w="1234"/>
+            <w:shd w:fill="F4F6F7" w:val="clear"/>
+          </w:tcPr>
+          <w:p>
+            <w:r>
+              <w:rPr>
+                <w:sz w:val="18"/>
+              </w:rPr>
+            </w:r>
+            <w:r>
+              <w:rPr>
+                <w:sz w:val="18"/>
+              </w:rPr>
+              <w:t>pad 8/4</w:t>
+            </w:r>
+          </w:p>
+        </w:tc>
+        <w:tc>
+          <w:tcPr>
+            <w:tcW w:type="dxa" w:w="1234"/>
+            <w:shd w:fill="F4F6F7" w:val="clear"/>
+          </w:tcPr>
+          <w:p>
+            <w:r>
+              <w:rPr>
+                <w:sz w:val="18"/>
+              </w:rPr>
+            </w:r>
+            <w:r>
+              <w:rPr>
+                <w:sz w:val="18"/>
+              </w:rPr>
+              <w:t>VariableID:2725:24281 / text 4:1271</w:t>
+            </w:r>
+          </w:p>
+        </w:tc>
+      </w:tr>
+      <w:tr>
+        <w:tc>
+          <w:tcPr>
+            <w:tcW w:type="dxa" w:w="1234"/>
+          </w:tcPr>
+          <w:p>
+            <w:r>
+              <w:rPr>
+                <w:sz w:val="18"/>
+              </w:rPr>
+            </w:r>
+            <w:r>
+              <w:rPr>
+                <w:sz w:val="18"/>
+              </w:rPr>
+              <w:t>Size swatch (default)</w:t>
+            </w:r>
+          </w:p>
+        </w:tc>
+        <w:tc>
+          <w:tcPr>
+            <w:tcW w:type="dxa" w:w="1234"/>
+          </w:tcPr>
+          <w:p>
+            <w:r>
+              <w:rPr>
+                <w:sz w:val="18"/>
+              </w:rPr>
+            </w:r>
+            <w:r>
+              <w:rPr>
+                <w:sz w:val="18"/>
+              </w:rPr>
+              <w:t>~30×24</w:t>
+            </w:r>
+          </w:p>
+        </w:tc>
+        <w:tc>
+          <w:tcPr>
+            <w:tcW w:type="dxa" w:w="1234"/>
+          </w:tcPr>
+          <w:p>
+            <w:r>
+              <w:rPr>
+                <w:sz w:val="18"/>
+              </w:rPr>
+            </w:r>
+            <w:r>
+              <w:rPr>
+                <w:sz w:val="18"/>
+              </w:rPr>
+              <w:t>400 12/17</w:t>
+            </w:r>
+          </w:p>
+        </w:tc>
+        <w:tc>
+          <w:tcPr>
+            <w:tcW w:type="dxa" w:w="1234"/>
+          </w:tcPr>
+          <w:p>
+            <w:r>
+              <w:rPr>
+                <w:sz w:val="18"/>
+              </w:rPr>
+            </w:r>
+            <w:r>
+              <w:rPr>
+                <w:sz w:val="18"/>
+              </w:rPr>
+              <w:t>text #2D2E33</w:t>
+            </w:r>
+          </w:p>
+        </w:tc>
+        <w:tc>
+          <w:tcPr>
+            <w:tcW w:type="dxa" w:w="1234"/>
+          </w:tcPr>
+          <w:p>
+            <w:r>
+              <w:rPr>
+                <w:sz w:val="18"/>
+              </w:rPr>
+            </w:r>
+            <w:r>
+              <w:rPr>
+                <w:sz w:val="18"/>
+              </w:rPr>
+              <w:t>stroke #D5CA9F</w:t>
+            </w:r>
+          </w:p>
+        </w:tc>
+        <w:tc>
+          <w:tcPr>
+            <w:tcW w:type="dxa" w:w="1234"/>
+          </w:tcPr>
+          <w:p>
+            <w:r>
+              <w:rPr>
+                <w:sz w:val="18"/>
+              </w:rPr>
+            </w:r>
+            <w:r>
+              <w:rPr>
+                <w:sz w:val="18"/>
+              </w:rPr>
+              <w:t>pad 8/4</w:t>
+            </w:r>
+          </w:p>
+        </w:tc>
+        <w:tc>
+          <w:tcPr>
+            <w:tcW w:type="dxa" w:w="1234"/>
+          </w:tcPr>
+          <w:p>
+            <w:r>
+              <w:rPr>
+                <w:sz w:val="18"/>
+              </w:rPr>
+            </w:r>
+            <w:r>
+              <w:rPr>
+                <w:sz w:val="18"/>
+              </w:rPr>
+              <w:t>text VariableID:4:1271</w:t>
+            </w:r>
+          </w:p>
+        </w:tc>
+      </w:tr>
+      <w:tr>
+        <w:tc>
+          <w:tcPr>
+            <w:tcW w:type="dxa" w:w="1234"/>
+            <w:shd w:fill="F4F6F7" w:val="clear"/>
+          </w:tcPr>
+          <w:p>
+            <w:r>
+              <w:rPr>
+                <w:sz w:val="18"/>
+              </w:rPr>
+            </w:r>
+            <w:r>
+              <w:rPr>
+                <w:sz w:val="18"/>
+              </w:rPr>
+              <w:t>Product name</w:t>
+            </w:r>
+          </w:p>
+        </w:tc>
+        <w:tc>
+          <w:tcPr>
+            <w:tcW w:type="dxa" w:w="1234"/>
+            <w:shd w:fill="F4F6F7" w:val="clear"/>
+          </w:tcPr>
+          <w:p>
+            <w:r>
+              <w:rPr>
+                <w:sz w:val="18"/>
+              </w:rPr>
+            </w:r>
+            <w:r>
+              <w:rPr>
+                <w:sz w:val="18"/>
+              </w:rPr>
+              <w:t>274×45</w:t>
+            </w:r>
+          </w:p>
+        </w:tc>
+        <w:tc>
+          <w:tcPr>
+            <w:tcW w:type="dxa" w:w="1234"/>
+            <w:shd w:fill="F4F6F7" w:val="clear"/>
+          </w:tcPr>
+          <w:p>
+            <w:r>
+              <w:rPr>
+                <w:sz w:val="18"/>
+              </w:rPr>
+            </w:r>
+            <w:r>
+              <w:rPr>
+                <w:sz w:val="18"/>
+              </w:rPr>
+              <w:t>500 16/22</w:t>
+            </w:r>
+          </w:p>
+        </w:tc>
+        <w:tc>
+          <w:tcPr>
+            <w:tcW w:type="dxa" w:w="1234"/>
+            <w:shd w:fill="F4F6F7" w:val="clear"/>
+          </w:tcPr>
+          <w:p>
+            <w:r>
+              <w:rPr>
+                <w:sz w:val="18"/>
+              </w:rPr>
+            </w:r>
+            <w:r>
+              <w:rPr>
+                <w:sz w:val="18"/>
+              </w:rPr>
+              <w:t>#000000</w:t>
+            </w:r>
+          </w:p>
+        </w:tc>
+        <w:tc>
+          <w:tcPr>
+            <w:tcW w:type="dxa" w:w="1234"/>
+            <w:shd w:fill="F4F6F7" w:val="clear"/>
+          </w:tcPr>
+          <w:p>
+            <w:r>
+              <w:rPr>
+                <w:sz w:val="18"/>
+              </w:rPr>
+            </w:r>
+            <w:r>
+              <w:rPr>
+                <w:sz w:val="18"/>
+              </w:rPr>
+              <w:t>—</w:t>
+            </w:r>
+          </w:p>
+        </w:tc>
+        <w:tc>
+          <w:tcPr>
+            <w:tcW w:type="dxa" w:w="1234"/>
+            <w:shd w:fill="F4F6F7" w:val="clear"/>
+          </w:tcPr>
+          <w:p>
+            <w:r>
+              <w:rPr>
+                <w:sz w:val="18"/>
+              </w:rPr>
+            </w:r>
+            <w:r>
+              <w:rPr>
+                <w:sz w:val="18"/>
+              </w:rPr>
+              <w:t>—</w:t>
+            </w:r>
+          </w:p>
+        </w:tc>
+        <w:tc>
+          <w:tcPr>
+            <w:tcW w:type="dxa" w:w="1234"/>
+            <w:shd w:fill="F4F6F7" w:val="clear"/>
+          </w:tcPr>
+          <w:p>
+            <w:r>
+              <w:rPr>
+                <w:sz w:val="18"/>
+              </w:rPr>
+            </w:r>
+            <w:r>
+              <w:rPr>
+                <w:sz w:val="18"/>
+              </w:rPr>
+              <w:t>VariableID:…531:95</w:t>
+            </w:r>
+          </w:p>
+        </w:tc>
+      </w:tr>
+      <w:tr>
+        <w:tc>
+          <w:tcPr>
+            <w:tcW w:type="dxa" w:w="1234"/>
+          </w:tcPr>
+          <w:p>
+            <w:r>
+              <w:rPr>
+                <w:sz w:val="18"/>
+              </w:rPr>
+            </w:r>
+            <w:r>
+              <w:rPr>
+                <w:sz w:val="18"/>
+              </w:rPr>
+              <w:t>Price (current)</w:t>
+            </w:r>
+          </w:p>
+        </w:tc>
+        <w:tc>
+          <w:tcPr>
+            <w:tcW w:type="dxa" w:w="1234"/>
+          </w:tcPr>
+          <w:p>
+            <w:r>
+              <w:rPr>
+                <w:sz w:val="18"/>
+              </w:rPr>
+            </w:r>
+            <w:r>
+              <w:rPr>
+                <w:sz w:val="18"/>
+              </w:rPr>
+              <w:t>49×23</w:t>
+            </w:r>
+          </w:p>
+        </w:tc>
+        <w:tc>
+          <w:tcPr>
+            <w:tcW w:type="dxa" w:w="1234"/>
+          </w:tcPr>
+          <w:p>
+            <w:r>
+              <w:rPr>
+                <w:sz w:val="18"/>
+              </w:rPr>
+            </w:r>
+            <w:r>
+              <w:rPr>
+                <w:sz w:val="18"/>
+              </w:rPr>
+              <w:t>500 16/22</w:t>
+            </w:r>
+          </w:p>
+        </w:tc>
+        <w:tc>
+          <w:tcPr>
+            <w:tcW w:type="dxa" w:w="1234"/>
+          </w:tcPr>
+          <w:p>
+            <w:r>
+              <w:rPr>
+                <w:sz w:val="18"/>
+              </w:rPr>
+            </w:r>
+            <w:r>
+              <w:rPr>
+                <w:sz w:val="18"/>
+              </w:rPr>
+              <w:t>#005640</w:t>
+            </w:r>
+          </w:p>
+        </w:tc>
+        <w:tc>
+          <w:tcPr>
+            <w:tcW w:type="dxa" w:w="1234"/>
+          </w:tcPr>
+          <w:p>
+            <w:r>
+              <w:rPr>
+                <w:sz w:val="18"/>
+              </w:rPr>
+            </w:r>
+            <w:r>
+              <w:rPr>
+                <w:sz w:val="18"/>
+              </w:rPr>
+              <w:t>—</w:t>
+            </w:r>
+          </w:p>
+        </w:tc>
+        <w:tc>
+          <w:tcPr>
+            <w:tcW w:type="dxa" w:w="1234"/>
+          </w:tcPr>
+          <w:p>
+            <w:r>
+              <w:rPr>
+                <w:sz w:val="18"/>
+              </w:rPr>
+            </w:r>
+            <w:r>
+              <w:rPr>
+                <w:sz w:val="18"/>
+              </w:rPr>
+              <w:t>gap 8</w:t>
+            </w:r>
+          </w:p>
+        </w:tc>
+        <w:tc>
+          <w:tcPr>
+            <w:tcW w:type="dxa" w:w="1234"/>
+          </w:tcPr>
+          <w:p>
+            <w:r>
+              <w:rPr>
+                <w:sz w:val="18"/>
+              </w:rPr>
+            </w:r>
+            <w:r>
+              <w:rPr>
+                <w:sz w:val="18"/>
+              </w:rPr>
+              <w:t>VariableID:…531:121</w:t>
+            </w:r>
+          </w:p>
+        </w:tc>
+      </w:tr>
+      <w:tr>
+        <w:tc>
+          <w:tcPr>
+            <w:tcW w:type="dxa" w:w="1234"/>
+            <w:shd w:fill="F4F6F7" w:val="clear"/>
+          </w:tcPr>
+          <w:p>
+            <w:r>
+              <w:rPr>
+                <w:sz w:val="18"/>
+              </w:rPr>
+            </w:r>
+            <w:r>
+              <w:rPr>
+                <w:sz w:val="18"/>
+              </w:rPr>
+              <w:t>Price (strikethrough)</w:t>
+            </w:r>
+          </w:p>
+        </w:tc>
+        <w:tc>
+          <w:tcPr>
+            <w:tcW w:type="dxa" w:w="1234"/>
+            <w:shd w:fill="F4F6F7" w:val="clear"/>
+          </w:tcPr>
+          <w:p>
+            <w:r>
+              <w:rPr>
+                <w:sz w:val="18"/>
+              </w:rPr>
+            </w:r>
+            <w:r>
+              <w:rPr>
+                <w:sz w:val="18"/>
+              </w:rPr>
+              <w:t>41×19</w:t>
+            </w:r>
+          </w:p>
+        </w:tc>
+        <w:tc>
+          <w:tcPr>
+            <w:tcW w:type="dxa" w:w="1234"/>
+            <w:shd w:fill="F4F6F7" w:val="clear"/>
+          </w:tcPr>
+          <w:p>
+            <w:r>
+              <w:rPr>
+                <w:sz w:val="18"/>
+              </w:rPr>
+            </w:r>
+            <w:r>
+              <w:rPr>
+                <w:sz w:val="18"/>
+              </w:rPr>
+              <w:t>400 14/18</w:t>
+            </w:r>
+          </w:p>
+        </w:tc>
+        <w:tc>
+          <w:tcPr>
+            <w:tcW w:type="dxa" w:w="1234"/>
+            <w:shd w:fill="F4F6F7" w:val="clear"/>
+          </w:tcPr>
+          <w:p>
+            <w:r>
+              <w:rPr>
+                <w:sz w:val="18"/>
+              </w:rPr>
+            </w:r>
+            <w:r>
+              <w:rPr>
+                <w:sz w:val="18"/>
+              </w:rPr>
+              <w:t>#626262</w:t>
+            </w:r>
+          </w:p>
+        </w:tc>
+        <w:tc>
+          <w:tcPr>
+            <w:tcW w:type="dxa" w:w="1234"/>
+            <w:shd w:fill="F4F6F7" w:val="clear"/>
+          </w:tcPr>
+          <w:p>
+            <w:r>
+              <w:rPr>
+                <w:sz w:val="18"/>
+              </w:rPr>
+            </w:r>
+            <w:r>
+              <w:rPr>
+                <w:sz w:val="18"/>
+              </w:rPr>
+              <w:t>—</w:t>
+            </w:r>
+          </w:p>
+        </w:tc>
+        <w:tc>
+          <w:tcPr>
+            <w:tcW w:type="dxa" w:w="1234"/>
+            <w:shd w:fill="F4F6F7" w:val="clear"/>
+          </w:tcPr>
+          <w:p>
+            <w:r>
+              <w:rPr>
+                <w:sz w:val="18"/>
+              </w:rPr>
+            </w:r>
+            <w:r>
+              <w:rPr>
+                <w:sz w:val="18"/>
+              </w:rPr>
+              <w:t>—</w:t>
+            </w:r>
+          </w:p>
+        </w:tc>
+        <w:tc>
+          <w:tcPr>
+            <w:tcW w:type="dxa" w:w="1234"/>
+            <w:shd w:fill="F4F6F7" w:val="clear"/>
+          </w:tcPr>
+          <w:p>
+            <w:r>
+              <w:rPr>
+                <w:sz w:val="18"/>
+              </w:rPr>
+            </w:r>
+            <w:r>
+              <w:rPr>
+                <w:sz w:val="18"/>
+              </w:rPr>
+              <w:t>VariableID:2751:46499</w:t>
+            </w:r>
+          </w:p>
+        </w:tc>
+      </w:tr>
+      <w:tr>
+        <w:tc>
+          <w:tcPr>
+            <w:tcW w:type="dxa" w:w="1234"/>
+          </w:tcPr>
+          <w:p>
+            <w:r>
+              <w:rPr>
+                <w:sz w:val="18"/>
+              </w:rPr>
+            </w:r>
+            <w:r>
+              <w:rPr>
+                <w:sz w:val="18"/>
+              </w:rPr>
+              <w:t>Discount label "30% Off"</w:t>
+            </w:r>
+          </w:p>
+        </w:tc>
+        <w:tc>
+          <w:tcPr>
+            <w:tcW w:type="dxa" w:w="1234"/>
+          </w:tcPr>
+          <w:p>
+            <w:r>
+              <w:rPr>
+                <w:sz w:val="18"/>
+              </w:rPr>
+            </w:r>
+            <w:r>
+              <w:rPr>
+                <w:sz w:val="18"/>
+              </w:rPr>
+              <w:t>44×17</w:t>
+            </w:r>
+          </w:p>
+        </w:tc>
+        <w:tc>
+          <w:tcPr>
+            <w:tcW w:type="dxa" w:w="1234"/>
+          </w:tcPr>
+          <w:p>
+            <w:r>
+              <w:rPr>
+                <w:sz w:val="18"/>
+              </w:rPr>
+            </w:r>
+            <w:r>
+              <w:rPr>
+                <w:sz w:val="18"/>
+              </w:rPr>
+              <w:t>500 12/17</w:t>
+            </w:r>
+          </w:p>
+        </w:tc>
+        <w:tc>
+          <w:tcPr>
+            <w:tcW w:type="dxa" w:w="1234"/>
+          </w:tcPr>
+          <w:p>
+            <w:r>
+              <w:rPr>
+                <w:sz w:val="18"/>
+              </w:rPr>
+            </w:r>
+            <w:r>
+              <w:rPr>
+                <w:sz w:val="18"/>
+              </w:rPr>
+              <w:t>#AF0061</w:t>
+            </w:r>
+          </w:p>
+        </w:tc>
+        <w:tc>
+          <w:tcPr>
+            <w:tcW w:type="dxa" w:w="1234"/>
+          </w:tcPr>
+          <w:p>
+            <w:r>
+              <w:rPr>
+                <w:sz w:val="18"/>
+              </w:rPr>
+            </w:r>
+            <w:r>
+              <w:rPr>
+                <w:sz w:val="18"/>
+              </w:rPr>
+              <w:t>—</w:t>
+            </w:r>
+          </w:p>
+        </w:tc>
+        <w:tc>
+          <w:tcPr>
+            <w:tcW w:type="dxa" w:w="1234"/>
+          </w:tcPr>
+          <w:p>
+            <w:r>
+              <w:rPr>
+                <w:sz w:val="18"/>
+              </w:rPr>
+            </w:r>
+            <w:r>
+              <w:rPr>
+                <w:sz w:val="18"/>
+              </w:rPr>
+              <w:t>—</w:t>
+            </w:r>
+          </w:p>
+        </w:tc>
+        <w:tc>
+          <w:tcPr>
+            <w:tcW w:type="dxa" w:w="1234"/>
+          </w:tcPr>
+          <w:p>
+            <w:r>
+              <w:rPr>
+                <w:sz w:val="18"/>
+              </w:rPr>
+            </w:r>
+            <w:r>
+              <w:rPr>
+                <w:sz w:val="18"/>
+              </w:rPr>
+              <w:t>VariableID:…531:113</w:t>
+            </w:r>
+          </w:p>
+        </w:tc>
+      </w:tr>
+      <w:tr>
+        <w:tc>
+          <w:tcPr>
+            <w:tcW w:type="dxa" w:w="1234"/>
+            <w:shd w:fill="F4F6F7" w:val="clear"/>
+          </w:tcPr>
+          <w:p>
+            <w:r>
+              <w:rPr>
+                <w:sz w:val="18"/>
+              </w:rPr>
+            </w:r>
+            <w:r>
+              <w:rPr>
+                <w:sz w:val="18"/>
+              </w:rPr>
+              <w:t>Discount pill bg</w:t>
+            </w:r>
+          </w:p>
+        </w:tc>
+        <w:tc>
+          <w:tcPr>
+            <w:tcW w:type="dxa" w:w="1234"/>
+            <w:shd w:fill="F4F6F7" w:val="clear"/>
+          </w:tcPr>
+          <w:p>
+            <w:r>
+              <w:rPr>
+                <w:sz w:val="18"/>
+              </w:rPr>
+            </w:r>
+            <w:r>
+              <w:rPr>
+                <w:sz w:val="18"/>
+              </w:rPr>
+              <w:t>55×21</w:t>
+            </w:r>
+          </w:p>
+        </w:tc>
+        <w:tc>
+          <w:tcPr>
+            <w:tcW w:type="dxa" w:w="1234"/>
+            <w:shd w:fill="F4F6F7" w:val="clear"/>
+          </w:tcPr>
+          <w:p>
+            <w:r>
+              <w:rPr>
+                <w:sz w:val="18"/>
+              </w:rPr>
+            </w:r>
+            <w:r>
+              <w:rPr>
+                <w:sz w:val="18"/>
+              </w:rPr>
+              <w:t>—</w:t>
+            </w:r>
+          </w:p>
+        </w:tc>
+        <w:tc>
+          <w:tcPr>
+            <w:tcW w:type="dxa" w:w="1234"/>
+            <w:shd w:fill="F4F6F7" w:val="clear"/>
+          </w:tcPr>
+          <w:p>
+            <w:r>
+              <w:rPr>
+                <w:sz w:val="18"/>
+              </w:rPr>
+            </w:r>
+            <w:r>
+              <w:rPr>
+                <w:sz w:val="18"/>
+              </w:rPr>
+              <w:t>#FCE8A6</w:t>
+            </w:r>
+          </w:p>
+        </w:tc>
+        <w:tc>
+          <w:tcPr>
+            <w:tcW w:type="dxa" w:w="1234"/>
+            <w:shd w:fill="F4F6F7" w:val="clear"/>
+          </w:tcPr>
+          <w:p>
+            <w:r>
+              <w:rPr>
+                <w:sz w:val="18"/>
+              </w:rPr>
+            </w:r>
+            <w:r>
+              <w:rPr>
+                <w:sz w:val="18"/>
+              </w:rPr>
+              <w:t>radius 2</w:t>
+            </w:r>
+          </w:p>
+        </w:tc>
+        <w:tc>
+          <w:tcPr>
+            <w:tcW w:type="dxa" w:w="1234"/>
+            <w:shd w:fill="F4F6F7" w:val="clear"/>
+          </w:tcPr>
+          <w:p>
+            <w:r>
+              <w:rPr>
+                <w:sz w:val="18"/>
+              </w:rPr>
+            </w:r>
+            <w:r>
+              <w:rPr>
+                <w:sz w:val="18"/>
+              </w:rPr>
+              <w:t>pad 5/2</w:t>
+            </w:r>
+          </w:p>
+        </w:tc>
+        <w:tc>
+          <w:tcPr>
+            <w:tcW w:type="dxa" w:w="1234"/>
+            <w:shd w:fill="F4F6F7" w:val="clear"/>
+          </w:tcPr>
+          <w:p>
+            <w:r>
+              <w:rPr>
+                <w:sz w:val="18"/>
+              </w:rPr>
+            </w:r>
+            <w:r>
+              <w:rPr>
+                <w:sz w:val="18"/>
+              </w:rPr>
+              <w:t>VariableID:4889:51655</w:t>
+            </w:r>
+          </w:p>
+        </w:tc>
+      </w:tr>
+      <w:tr>
+        <w:tc>
+          <w:tcPr>
+            <w:tcW w:type="dxa" w:w="1234"/>
+          </w:tcPr>
+          <w:p>
+            <w:r>
+              <w:rPr>
+                <w:sz w:val="18"/>
+              </w:rPr>
+            </w:r>
+            <w:r>
+              <w:rPr>
+                <w:sz w:val="18"/>
+              </w:rPr>
+              <w:t>Text container</w:t>
+            </w:r>
+          </w:p>
+        </w:tc>
+        <w:tc>
+          <w:tcPr>
+            <w:tcW w:type="dxa" w:w="1234"/>
+          </w:tcPr>
+          <w:p>
+            <w:r>
+              <w:rPr>
+                <w:sz w:val="18"/>
+              </w:rPr>
+            </w:r>
+            <w:r>
+              <w:rPr>
+                <w:sz w:val="18"/>
+              </w:rPr>
+              <w:t>274×148</w:t>
+            </w:r>
+          </w:p>
+        </w:tc>
+        <w:tc>
+          <w:tcPr>
+            <w:tcW w:type="dxa" w:w="1234"/>
+          </w:tcPr>
+          <w:p>
+            <w:r>
+              <w:rPr>
+                <w:sz w:val="18"/>
+              </w:rPr>
+            </w:r>
+            <w:r>
+              <w:rPr>
+                <w:sz w:val="18"/>
+              </w:rPr>
+              <w:t>—</w:t>
+            </w:r>
+          </w:p>
+        </w:tc>
+        <w:tc>
+          <w:tcPr>
+            <w:tcW w:type="dxa" w:w="1234"/>
+          </w:tcPr>
+          <w:p>
+            <w:r>
+              <w:rPr>
+                <w:sz w:val="18"/>
+              </w:rPr>
+            </w:r>
+            <w:r>
+              <w:rPr>
+                <w:sz w:val="18"/>
+              </w:rPr>
+              <w:t>—</w:t>
+            </w:r>
+          </w:p>
+        </w:tc>
+        <w:tc>
+          <w:tcPr>
+            <w:tcW w:type="dxa" w:w="1234"/>
+          </w:tcPr>
+          <w:p>
+            <w:r>
+              <w:rPr>
+                <w:sz w:val="18"/>
+              </w:rPr>
+            </w:r>
+            <w:r>
+              <w:rPr>
+                <w:sz w:val="18"/>
+              </w:rPr>
+              <w:t>—</w:t>
+            </w:r>
+          </w:p>
+        </w:tc>
+        <w:tc>
+          <w:tcPr>
+            <w:tcW w:type="dxa" w:w="1234"/>
+          </w:tcPr>
+          <w:p>
+            <w:r>
+              <w:rPr>
+                <w:sz w:val="18"/>
+              </w:rPr>
+            </w:r>
+            <w:r>
+              <w:rPr>
+                <w:sz w:val="18"/>
+              </w:rPr>
+              <w:t>gap 12</w:t>
+            </w:r>
+          </w:p>
+        </w:tc>
+        <w:tc>
+          <w:tcPr>
+            <w:tcW w:type="dxa" w:w="1234"/>
+          </w:tcPr>
+          <w:p>
+            <w:r>
+              <w:rPr>
+                <w:sz w:val="18"/>
+              </w:rPr>
+            </w:r>
+            <w:r>
+              <w:rPr>
+                <w:sz w:val="18"/>
+              </w:rPr>
+              <w:t>—</w:t>
+            </w:r>
+          </w:p>
+        </w:tc>
+      </w:tr>
+    </w:tbl>
+    <w:p/>
+    <w:p>
+      <w:r>
+        <w:rPr>
+          <w:b/>
+        </w:rPr>
+        <w:t>Color inventory (resolved hex):</w:t>
+      </w:r>
+      <w:r>
+        <w:t xml:space="preserve"> GS green </w:t>
+      </w:r>
+      <w:r>
+        <w:rPr>
+          <w:rFonts w:ascii="Consolas" w:hAnsi="Consolas"/>
+          <w:color w:val="8B0000"/>
+          <w:sz w:val="18"/>
+        </w:rPr>
+        <w:t>#005640</w:t>
+      </w:r>
+      <w:r>
+        <w:t xml:space="preserve"> (price, primary CTA text/icon); bright green </w:t>
+      </w:r>
+      <w:r>
+        <w:rPr>
+          <w:rFonts w:ascii="Consolas" w:hAnsi="Consolas"/>
+          <w:color w:val="8B0000"/>
+          <w:sz w:val="18"/>
+        </w:rPr>
+        <w:t>#00B451</w:t>
+      </w:r>
+      <w:r>
+        <w:t xml:space="preserve"> / </w:t>
+      </w:r>
+      <w:r>
+        <w:rPr>
+          <w:rFonts w:ascii="Consolas" w:hAnsi="Consolas"/>
+          <w:color w:val="8B0000"/>
+          <w:sz w:val="18"/>
+        </w:rPr>
+        <w:t>#00AE43</w:t>
+      </w:r>
+      <w:r>
+        <w:t xml:space="preserve"> (NEW tag / alt CTA border); light greens </w:t>
+      </w:r>
+      <w:r>
+        <w:rPr>
+          <w:rFonts w:ascii="Consolas" w:hAnsi="Consolas"/>
+          <w:color w:val="8B0000"/>
+          <w:sz w:val="18"/>
+        </w:rPr>
+        <w:t>#D9F3E3</w:t>
+      </w:r>
+      <w:r>
+        <w:t xml:space="preserve"> / </w:t>
+      </w:r>
+      <w:r>
+        <w:rPr>
+          <w:rFonts w:ascii="Consolas" w:hAnsi="Consolas"/>
+          <w:color w:val="8B0000"/>
+          <w:sz w:val="18"/>
+        </w:rPr>
+        <w:t>#F0FAF4</w:t>
+      </w:r>
+      <w:r>
+        <w:t xml:space="preserve"> / </w:t>
+      </w:r>
+      <w:r>
+        <w:rPr>
+          <w:rFonts w:ascii="Consolas" w:hAnsi="Consolas"/>
+          <w:color w:val="8B0000"/>
+          <w:sz w:val="18"/>
+        </w:rPr>
+        <w:t>#98DEB3</w:t>
+      </w:r>
+      <w:r>
+        <w:t xml:space="preserve"> (CTA fills/strokes); tan </w:t>
+      </w:r>
+      <w:r>
+        <w:rPr>
+          <w:rFonts w:ascii="Consolas" w:hAnsi="Consolas"/>
+          <w:color w:val="8B0000"/>
+          <w:sz w:val="18"/>
+        </w:rPr>
+        <w:t>#D5CA9F</w:t>
+      </w:r>
+      <w:r>
+        <w:t xml:space="preserve"> (card + swatch borders); purple </w:t>
+      </w:r>
+      <w:r>
+        <w:rPr>
+          <w:rFonts w:ascii="Consolas" w:hAnsi="Consolas"/>
+          <w:color w:val="8B0000"/>
+          <w:sz w:val="18"/>
+        </w:rPr>
+        <w:t>#5C1F8B</w:t>
+      </w:r>
+      <w:r>
+        <w:t xml:space="preserve"> (Best Seller); amber </w:t>
+      </w:r>
+      <w:r>
+        <w:rPr>
+          <w:rFonts w:ascii="Consolas" w:hAnsi="Consolas"/>
+          <w:color w:val="8B0000"/>
+          <w:sz w:val="18"/>
+        </w:rPr>
+        <w:t>#F7BE00</w:t>
+      </w:r>
+      <w:r>
+        <w:t xml:space="preserve"> / </w:t>
+      </w:r>
+      <w:r>
+        <w:rPr>
+          <w:rFonts w:ascii="Consolas" w:hAnsi="Consolas"/>
+          <w:color w:val="8B0000"/>
+          <w:sz w:val="18"/>
+        </w:rPr>
+        <w:t>#FCE8A6</w:t>
+      </w:r>
+      <w:r>
+        <w:t xml:space="preserve"> (Almost Gone / discount pill bg); magenta/pink </w:t>
+      </w:r>
+      <w:r>
+        <w:rPr>
+          <w:rFonts w:ascii="Consolas" w:hAnsi="Consolas"/>
+          <w:color w:val="8B0000"/>
+          <w:sz w:val="18"/>
+        </w:rPr>
+        <w:t>#AF0061</w:t>
+      </w:r>
+      <w:r>
+        <w:t xml:space="preserve"> (discount text); reds </w:t>
+      </w:r>
+      <w:r>
+        <w:rPr>
+          <w:rFonts w:ascii="Consolas" w:hAnsi="Consolas"/>
+          <w:color w:val="8B0000"/>
+          <w:sz w:val="18"/>
+        </w:rPr>
+        <w:t>#9C0000</w:t>
+      </w:r>
+      <w:r>
+        <w:t xml:space="preserve"> (sale bg); neutrals </w:t>
+      </w:r>
+      <w:r>
+        <w:rPr>
+          <w:rFonts w:ascii="Consolas" w:hAnsi="Consolas"/>
+          <w:color w:val="8B0000"/>
+          <w:sz w:val="18"/>
+        </w:rPr>
+        <w:t>#000000</w:t>
+      </w:r>
+      <w:r>
+        <w:t xml:space="preserve">, </w:t>
+      </w:r>
+      <w:r>
+        <w:rPr>
+          <w:rFonts w:ascii="Consolas" w:hAnsi="Consolas"/>
+          <w:color w:val="8B0000"/>
+          <w:sz w:val="18"/>
+        </w:rPr>
+        <w:t>#2D2E33</w:t>
+      </w:r>
+      <w:r>
+        <w:t xml:space="preserve">, </w:t>
+      </w:r>
+      <w:r>
+        <w:rPr>
+          <w:rFonts w:ascii="Consolas" w:hAnsi="Consolas"/>
+          <w:color w:val="8B0000"/>
+          <w:sz w:val="18"/>
+        </w:rPr>
+        <w:t>#626262</w:t>
+      </w:r>
+      <w:r>
+        <w:t xml:space="preserve">, </w:t>
+      </w:r>
+      <w:r>
+        <w:rPr>
+          <w:rFonts w:ascii="Consolas" w:hAnsi="Consolas"/>
+          <w:color w:val="8B0000"/>
+          <w:sz w:val="18"/>
+        </w:rPr>
+        <w:t>#4E4E4E</w:t>
+      </w:r>
+      <w:r>
+        <w:t xml:space="preserve">, </w:t>
+      </w:r>
+      <w:r>
+        <w:rPr>
+          <w:rFonts w:ascii="Consolas" w:hAnsi="Consolas"/>
+          <w:color w:val="8B0000"/>
+          <w:sz w:val="18"/>
+        </w:rPr>
+        <w:t>#FFFFFF</w:t>
+      </w:r>
+      <w:r>
+        <w:t>.</w:t>
+      </w:r>
+    </w:p>
+    <w:p>
+      <w:r>
+        <w:rPr>
+          <w:b/>
+          <w:color w:val="2980B9"/>
+        </w:rPr>
+        <w:t xml:space="preserve">Note: </w:t>
+      </w:r>
+      <w:r>
+        <w:t xml:space="preserve">Every colored element is bound to a Figma </w:t>
+      </w:r>
+      <w:r>
+        <w:rPr>
+          <w:b/>
+        </w:rPr>
+        <w:t>variable</w:t>
+      </w:r>
+      <w:r>
+        <w:t xml:space="preserve"> (design token) — IDs captured above. The token </w:t>
+      </w:r>
+      <w:r>
+        <w:rPr>
+          <w:b/>
+        </w:rPr>
+        <w:t>names</w:t>
+      </w:r>
+      <w:r>
+        <w:t xml:space="preserve"> (e.g., </w:t>
+      </w:r>
+      <w:r>
+        <w:rPr>
+          <w:rFonts w:ascii="Consolas" w:hAnsi="Consolas"/>
+          <w:color w:val="8B0000"/>
+          <w:sz w:val="18"/>
+        </w:rPr>
+        <w:t>gs/color/green/600</w:t>
+      </w:r>
+      <w:r>
+        <w:t xml:space="preserve">) could not be pulled because the Figma variables REST endpoint requires an Enterprise plan (403 on this file). Ask the design team to export the variable name→value map, or map these values to the GSUSA design tokens in </w:t>
+      </w:r>
+      <w:r>
+        <w:rPr>
+          <w:rFonts w:ascii="Consolas" w:hAnsi="Consolas"/>
+          <w:color w:val="8B0000"/>
+          <w:sz w:val="18"/>
+        </w:rPr>
+        <w:t>styles.css</w:t>
+      </w:r>
+      <w:r>
+        <w:t xml:space="preserve"> during build.</w:t>
+      </w:r>
+    </w:p>
+    <w:p>
+      <w:pPr>
+        <w:pStyle w:val="Heading2"/>
+      </w:pPr>
+      <w:r>
         <w:t>EDS DA Authoring Details</w:t>
       </w:r>
     </w:p>

</xml_diff>